<commit_message>
Phase 6: ICT/SMC pipeline complet + audit securite - 472 tests passing
Backend (347 tests):
- Pipeline ICT: multi-TF signal gen, risk mgr (12 checks), position mgr (4 modes)
- Trade journal avec stats etendues (PF, expectancy, max DD, by instrument/session)
- Volatilite XAU/USD, anti-martingale, trailing stop structurel
- Confluence scoring 10pts, SL structurel + buffer, TP liquidites
- Securite: WS auth bypass fix, SQLite thread-safety, double risk mgr supprime
- 13 nouveaux tests (volatilite, trailing, stats etendues)

Frontend (125 tests):
- AlertWebSocketProvider (WS partage, sans duplication)
- Dashboard grid/hero/sidebar, 16 sections
- Build OK (2237 modules)

Cahier des charges: 24/24 sections conformes
</commit_message>
<xml_diff>
--- a/AEGIS_AI_QUANT_V1.docx
+++ b/AEGIS_AI_QUANT_V1.docx
@@ -6,7 +6,6 @@
       <w:pPr>
         <w:spacing w:before="2200"/>
       </w:pPr>
-      <w:bookmarkStart w:id="0" w:name="_GoBack"/>
     </w:p>
     <w:p>
       <w:pPr>
@@ -106,7 +105,7 @@
         </w:pBdr>
         <w:spacing w:before="480" w:after="200"/>
       </w:pPr>
-      <w:bookmarkStart w:id="1" w:name="_Toc233973904"/>
+      <w:bookmarkStart w:id="0" w:name="_Toc233973904"/>
       <w:r>
         <w:rPr>
           <w:b/>
@@ -116,7 +115,7 @@
         <w:lastRenderedPageBreak/>
         <w:t>Sommaire</w:t>
       </w:r>
-      <w:bookmarkEnd w:id="1"/>
+      <w:bookmarkEnd w:id="0"/>
     </w:p>
     <w:sdt>
       <w:sdtPr>
@@ -595,7 +594,7 @@
         </w:pBdr>
         <w:spacing w:before="480" w:after="200"/>
       </w:pPr>
-      <w:bookmarkStart w:id="2" w:name="_Toc233973905"/>
+      <w:bookmarkStart w:id="1" w:name="_Toc233973905"/>
       <w:r>
         <w:rPr>
           <w:b/>
@@ -605,7 +604,7 @@
         <w:lastRenderedPageBreak/>
         <w:t>1. Vision</w:t>
       </w:r>
-      <w:bookmarkEnd w:id="2"/>
+      <w:bookmarkEnd w:id="1"/>
     </w:p>
     <w:p>
       <w:pPr>
@@ -769,7 +768,31 @@
           <w:sz w:val="22"/>
           <w:szCs w:val="22"/>
         </w:rPr>
-        <w:t>L'objectif est de maximiser la robustesse et l'espérance de gain, pas de garantir des profits.</w:t>
+        <w:t>L'objectif est de maximiser la robustesse et l'espérance de gain,</w:t>
+      </w:r>
+      <w:r>
+        <w:rPr>
+          <w:b/>
+          <w:bCs/>
+          <w:i/>
+          <w:iCs/>
+          <w:color w:val="0B2545"/>
+          <w:sz w:val="22"/>
+          <w:szCs w:val="22"/>
+        </w:rPr>
+        <w:t xml:space="preserve"> et</w:t>
+      </w:r>
+      <w:r>
+        <w:rPr>
+          <w:b/>
+          <w:bCs/>
+          <w:i/>
+          <w:iCs/>
+          <w:color w:val="0B2545"/>
+          <w:sz w:val="22"/>
+          <w:szCs w:val="22"/>
+        </w:rPr>
+        <w:t xml:space="preserve"> de garantir des profits.</w:t>
       </w:r>
     </w:p>
     <w:p>
@@ -785,7 +808,7 @@
         </w:pBdr>
         <w:spacing w:before="480" w:after="200"/>
       </w:pPr>
-      <w:bookmarkStart w:id="3" w:name="_Toc233973906"/>
+      <w:bookmarkStart w:id="2" w:name="_Toc233973906"/>
       <w:r>
         <w:rPr>
           <w:b/>
@@ -795,17 +818,14 @@
         <w:lastRenderedPageBreak/>
         <w:t>2. Architecture générale</w:t>
       </w:r>
-      <w:bookmarkEnd w:id="3"/>
+      <w:bookmarkEnd w:id="2"/>
     </w:p>
     <w:p>
       <w:pPr>
         <w:spacing w:after="140" w:line="276" w:lineRule="auto"/>
       </w:pPr>
       <w:r>
-        <w:t>Le</w:t>
-      </w:r>
-      <w:r>
-        <w:t xml:space="preserve"> système suit un pipeline linéaire, de la collecte des données brutes jusqu'au déploiement sécurisé des améliorations, en passant par l'analyse, la décision et l'exécution.</w:t>
+        <w:t>Le système suit un pipeline linéaire, de la collecte des données brutes jusqu'au déploiement sécurisé des améliorations, en passant par l'analyse, la décision et l'exécution.</w:t>
       </w:r>
     </w:p>
     <w:p>
@@ -835,12 +855,6 @@
         <w:gridCol w:w="6200"/>
       </w:tblGrid>
       <w:tr>
-        <w:tblPrEx>
-          <w:tblCellMar>
-            <w:top w:w="0" w:type="dxa"/>
-            <w:bottom w:w="0" w:type="dxa"/>
-          </w:tblCellMar>
-        </w:tblPrEx>
         <w:trPr>
           <w:jc w:val="center"/>
         </w:trPr>
@@ -918,12 +932,6 @@
         <w:gridCol w:w="6200"/>
       </w:tblGrid>
       <w:tr>
-        <w:tblPrEx>
-          <w:tblCellMar>
-            <w:top w:w="0" w:type="dxa"/>
-            <w:bottom w:w="0" w:type="dxa"/>
-          </w:tblCellMar>
-        </w:tblPrEx>
         <w:trPr>
           <w:jc w:val="center"/>
         </w:trPr>
@@ -1001,12 +1009,6 @@
         <w:gridCol w:w="6200"/>
       </w:tblGrid>
       <w:tr>
-        <w:tblPrEx>
-          <w:tblCellMar>
-            <w:top w:w="0" w:type="dxa"/>
-            <w:bottom w:w="0" w:type="dxa"/>
-          </w:tblCellMar>
-        </w:tblPrEx>
         <w:trPr>
           <w:jc w:val="center"/>
         </w:trPr>
@@ -1084,12 +1086,6 @@
         <w:gridCol w:w="6200"/>
       </w:tblGrid>
       <w:tr>
-        <w:tblPrEx>
-          <w:tblCellMar>
-            <w:top w:w="0" w:type="dxa"/>
-            <w:bottom w:w="0" w:type="dxa"/>
-          </w:tblCellMar>
-        </w:tblPrEx>
         <w:trPr>
           <w:jc w:val="center"/>
         </w:trPr>
@@ -1115,6 +1111,7 @@
             <w:pPr>
               <w:jc w:val="center"/>
             </w:pPr>
+            <w:proofErr w:type="spellStart"/>
             <w:r>
               <w:rPr>
                 <w:b/>
@@ -1123,7 +1120,18 @@
                 <w:sz w:val="20"/>
                 <w:szCs w:val="20"/>
               </w:rPr>
-              <w:t>Feature Engineering</w:t>
+              <w:t>Feature</w:t>
+            </w:r>
+            <w:proofErr w:type="spellEnd"/>
+            <w:r>
+              <w:rPr>
+                <w:b/>
+                <w:bCs/>
+                <w:color w:val="0B2545"/>
+                <w:sz w:val="20"/>
+                <w:szCs w:val="20"/>
+              </w:rPr>
+              <w:t xml:space="preserve"> Engineering</w:t>
             </w:r>
           </w:p>
         </w:tc>
@@ -1167,12 +1175,6 @@
         <w:gridCol w:w="6200"/>
       </w:tblGrid>
       <w:tr>
-        <w:tblPrEx>
-          <w:tblCellMar>
-            <w:top w:w="0" w:type="dxa"/>
-            <w:bottom w:w="0" w:type="dxa"/>
-          </w:tblCellMar>
-        </w:tblPrEx>
         <w:trPr>
           <w:jc w:val="center"/>
         </w:trPr>
@@ -1250,12 +1252,6 @@
         <w:gridCol w:w="6200"/>
       </w:tblGrid>
       <w:tr>
-        <w:tblPrEx>
-          <w:tblCellMar>
-            <w:top w:w="0" w:type="dxa"/>
-            <w:bottom w:w="0" w:type="dxa"/>
-          </w:tblCellMar>
-        </w:tblPrEx>
         <w:trPr>
           <w:jc w:val="center"/>
         </w:trPr>
@@ -1333,12 +1329,6 @@
         <w:gridCol w:w="6200"/>
       </w:tblGrid>
       <w:tr>
-        <w:tblPrEx>
-          <w:tblCellMar>
-            <w:top w:w="0" w:type="dxa"/>
-            <w:bottom w:w="0" w:type="dxa"/>
-          </w:tblCellMar>
-        </w:tblPrEx>
         <w:trPr>
           <w:jc w:val="center"/>
         </w:trPr>
@@ -1416,12 +1406,6 @@
         <w:gridCol w:w="6200"/>
       </w:tblGrid>
       <w:tr>
-        <w:tblPrEx>
-          <w:tblCellMar>
-            <w:top w:w="0" w:type="dxa"/>
-            <w:bottom w:w="0" w:type="dxa"/>
-          </w:tblCellMar>
-        </w:tblPrEx>
         <w:trPr>
           <w:jc w:val="center"/>
         </w:trPr>
@@ -1499,12 +1483,6 @@
         <w:gridCol w:w="6200"/>
       </w:tblGrid>
       <w:tr>
-        <w:tblPrEx>
-          <w:tblCellMar>
-            <w:top w:w="0" w:type="dxa"/>
-            <w:bottom w:w="0" w:type="dxa"/>
-          </w:tblCellMar>
-        </w:tblPrEx>
         <w:trPr>
           <w:jc w:val="center"/>
         </w:trPr>
@@ -1582,12 +1560,6 @@
         <w:gridCol w:w="6200"/>
       </w:tblGrid>
       <w:tr>
-        <w:tblPrEx>
-          <w:tblCellMar>
-            <w:top w:w="0" w:type="dxa"/>
-            <w:bottom w:w="0" w:type="dxa"/>
-          </w:tblCellMar>
-        </w:tblPrEx>
         <w:trPr>
           <w:jc w:val="center"/>
         </w:trPr>
@@ -1665,12 +1637,6 @@
         <w:gridCol w:w="6200"/>
       </w:tblGrid>
       <w:tr>
-        <w:tblPrEx>
-          <w:tblCellMar>
-            <w:top w:w="0" w:type="dxa"/>
-            <w:bottom w:w="0" w:type="dxa"/>
-          </w:tblCellMar>
-        </w:tblPrEx>
         <w:trPr>
           <w:jc w:val="center"/>
         </w:trPr>
@@ -1748,12 +1714,6 @@
         <w:gridCol w:w="6200"/>
       </w:tblGrid>
       <w:tr>
-        <w:tblPrEx>
-          <w:tblCellMar>
-            <w:top w:w="0" w:type="dxa"/>
-            <w:bottom w:w="0" w:type="dxa"/>
-          </w:tblCellMar>
-        </w:tblPrEx>
         <w:trPr>
           <w:jc w:val="center"/>
         </w:trPr>
@@ -1831,12 +1791,6 @@
         <w:gridCol w:w="6200"/>
       </w:tblGrid>
       <w:tr>
-        <w:tblPrEx>
-          <w:tblCellMar>
-            <w:top w:w="0" w:type="dxa"/>
-            <w:bottom w:w="0" w:type="dxa"/>
-          </w:tblCellMar>
-        </w:tblPrEx>
         <w:trPr>
           <w:jc w:val="center"/>
         </w:trPr>
@@ -1889,7 +1843,7 @@
         </w:pBdr>
         <w:spacing w:before="480" w:after="200"/>
       </w:pPr>
-      <w:bookmarkStart w:id="4" w:name="_Toc233973907"/>
+      <w:bookmarkStart w:id="3" w:name="_Toc233973907"/>
       <w:r>
         <w:rPr>
           <w:b/>
@@ -1897,9 +1851,18 @@
           <w:color w:val="0B2545"/>
         </w:rPr>
         <w:lastRenderedPageBreak/>
-        <w:t>3. Les 15 modules</w:t>
-      </w:r>
-      <w:bookmarkEnd w:id="4"/>
+        <w:t>3</w:t>
+      </w:r>
+      <w:bookmarkStart w:id="4" w:name="_GoBack"/>
+      <w:r>
+        <w:rPr>
+          <w:b/>
+          <w:bCs/>
+          <w:color w:val="0B2545"/>
+        </w:rPr>
+        <w:t>. Les 15 modules</w:t>
+      </w:r>
+      <w:bookmarkEnd w:id="3"/>
     </w:p>
     <w:p>
       <w:pPr>
@@ -1951,20 +1914,76 @@
         <w:spacing w:after="60"/>
       </w:pPr>
       <w:r>
-        <w:t>Données marché : OHLCV, Tick Data, Order Book, Trades, Volume, Liquidité, Funding Rate, Open Interest, Options (si disponibles)</w:t>
-      </w:r>
-    </w:p>
-    <w:p>
-      <w:pPr>
-        <w:pStyle w:val="Paragraphedeliste"/>
-        <w:numPr>
-          <w:ilvl w:val="0"/>
-          <w:numId w:val="2"/>
-        </w:numPr>
-        <w:spacing w:after="60"/>
-      </w:pPr>
-      <w:r>
-        <w:t>Données macro : Dominance BTC, Dominance des stablecoins, Fear &amp; Greed, Calendrier économique, Événements majeurs</w:t>
+        <w:t xml:space="preserve">Données marché : OHLCV, </w:t>
+      </w:r>
+      <w:proofErr w:type="spellStart"/>
+      <w:r>
+        <w:t>Tick</w:t>
+      </w:r>
+      <w:proofErr w:type="spellEnd"/>
+      <w:r>
+        <w:t xml:space="preserve"> Data, </w:t>
+      </w:r>
+      <w:proofErr w:type="spellStart"/>
+      <w:r>
+        <w:t>Order</w:t>
+      </w:r>
+      <w:proofErr w:type="spellEnd"/>
+      <w:r>
+        <w:t xml:space="preserve"> Book, </w:t>
+      </w:r>
+      <w:proofErr w:type="spellStart"/>
+      <w:r>
+        <w:t>Trades</w:t>
+      </w:r>
+      <w:proofErr w:type="spellEnd"/>
+      <w:r>
+        <w:t xml:space="preserve">, Volume, Liquidité, </w:t>
+      </w:r>
+      <w:proofErr w:type="spellStart"/>
+      <w:r>
+        <w:t>Funding</w:t>
+      </w:r>
+      <w:proofErr w:type="spellEnd"/>
+      <w:r>
+        <w:t xml:space="preserve"> Rate, Open </w:t>
+      </w:r>
+      <w:proofErr w:type="spellStart"/>
+      <w:r>
+        <w:t>Interest</w:t>
+      </w:r>
+      <w:proofErr w:type="spellEnd"/>
+      <w:r>
+        <w:t>, Options (si disponibles)</w:t>
+      </w:r>
+    </w:p>
+    <w:p>
+      <w:pPr>
+        <w:pStyle w:val="Paragraphedeliste"/>
+        <w:numPr>
+          <w:ilvl w:val="0"/>
+          <w:numId w:val="2"/>
+        </w:numPr>
+        <w:spacing w:after="60"/>
+      </w:pPr>
+      <w:r>
+        <w:t xml:space="preserve">Données macro : Dominance BTC, Dominance des </w:t>
+      </w:r>
+      <w:proofErr w:type="spellStart"/>
+      <w:r>
+        <w:t>stablecoins</w:t>
+      </w:r>
+      <w:proofErr w:type="spellEnd"/>
+      <w:r>
+        <w:t xml:space="preserve">, Fear &amp; </w:t>
+      </w:r>
+      <w:proofErr w:type="spellStart"/>
+      <w:r>
+        <w:t>Greed</w:t>
+      </w:r>
+      <w:proofErr w:type="spellEnd"/>
+      <w:r>
+        <w:t>, Calendrier économique, Événements majeurs</w:t>
       </w:r>
     </w:p>
     <w:p>
@@ -2017,8 +2036,99 @@
           <w:sz w:val="22"/>
           <w:szCs w:val="22"/>
         </w:rPr>
-        <w:t>Validation des donnée</w:t>
-      </w:r>
+        <w:t>Validation des données</w:t>
+      </w:r>
+    </w:p>
+    <w:p>
+      <w:pPr>
+        <w:spacing w:after="140" w:line="276" w:lineRule="auto"/>
+      </w:pPr>
+      <w:r>
+        <w:t>Il détecte :</w:t>
+      </w:r>
+    </w:p>
+    <w:p>
+      <w:pPr>
+        <w:pStyle w:val="Paragraphedeliste"/>
+        <w:numPr>
+          <w:ilvl w:val="0"/>
+          <w:numId w:val="2"/>
+        </w:numPr>
+        <w:spacing w:after="60"/>
+      </w:pPr>
+      <w:r>
+        <w:t>Données manquantes</w:t>
+      </w:r>
+    </w:p>
+    <w:p>
+      <w:pPr>
+        <w:pStyle w:val="Paragraphedeliste"/>
+        <w:numPr>
+          <w:ilvl w:val="0"/>
+          <w:numId w:val="2"/>
+        </w:numPr>
+        <w:spacing w:after="60"/>
+      </w:pPr>
+      <w:r>
+        <w:t>Valeurs aberrantes</w:t>
+      </w:r>
+    </w:p>
+    <w:p>
+      <w:pPr>
+        <w:pStyle w:val="Paragraphedeliste"/>
+        <w:numPr>
+          <w:ilvl w:val="0"/>
+          <w:numId w:val="2"/>
+        </w:numPr>
+        <w:spacing w:after="60"/>
+      </w:pPr>
+      <w:r>
+        <w:t>Désynchronisation</w:t>
+      </w:r>
+    </w:p>
+    <w:p>
+      <w:pPr>
+        <w:pStyle w:val="Paragraphedeliste"/>
+        <w:numPr>
+          <w:ilvl w:val="0"/>
+          <w:numId w:val="2"/>
+        </w:numPr>
+        <w:spacing w:after="60"/>
+      </w:pPr>
+      <w:r>
+        <w:t>Doublons</w:t>
+      </w:r>
+    </w:p>
+    <w:p>
+      <w:pPr>
+        <w:spacing w:after="140" w:line="276" w:lineRule="auto"/>
+      </w:pPr>
+      <w:r>
+        <w:t>Aucune décision n'est prise avec des données jugées incohérentes.</w:t>
+      </w:r>
+    </w:p>
+    <w:p>
+      <w:pPr>
+        <w:shd w:val="clear" w:color="auto" w:fill="1B5FA8"/>
+        <w:spacing w:before="320" w:after="120"/>
+      </w:pPr>
+      <w:r>
+        <w:rPr>
+          <w:b/>
+          <w:bCs/>
+          <w:color w:val="FFFFFF"/>
+          <w:sz w:val="18"/>
+          <w:szCs w:val="18"/>
+        </w:rPr>
+        <w:t>MODULE 3</w:t>
+      </w:r>
+    </w:p>
+    <w:p>
+      <w:pPr>
+        <w:pStyle w:val="Titre3"/>
+        <w:spacing w:before="220" w:after="100"/>
+      </w:pPr>
+      <w:proofErr w:type="spellStart"/>
       <w:r>
         <w:rPr>
           <w:b/>
@@ -2027,7 +2137,18 @@
           <w:sz w:val="22"/>
           <w:szCs w:val="22"/>
         </w:rPr>
-        <w:t>s</w:t>
+        <w:t>Feature</w:t>
+      </w:r>
+      <w:proofErr w:type="spellEnd"/>
+      <w:r>
+        <w:rPr>
+          <w:b/>
+          <w:bCs/>
+          <w:color w:val="0B2545"/>
+          <w:sz w:val="22"/>
+          <w:szCs w:val="22"/>
+        </w:rPr>
+        <w:t xml:space="preserve"> Engineering</w:t>
       </w:r>
     </w:p>
     <w:p>
@@ -2035,67 +2156,100 @@
         <w:spacing w:after="140" w:line="276" w:lineRule="auto"/>
       </w:pPr>
       <w:r>
-        <w:t>Il détecte :</w:t>
-      </w:r>
-    </w:p>
-    <w:p>
-      <w:pPr>
-        <w:pStyle w:val="Paragraphedeliste"/>
-        <w:numPr>
-          <w:ilvl w:val="0"/>
-          <w:numId w:val="2"/>
-        </w:numPr>
-        <w:spacing w:after="60"/>
-      </w:pPr>
-      <w:r>
-        <w:t>Données manquantes</w:t>
-      </w:r>
-    </w:p>
-    <w:p>
-      <w:pPr>
-        <w:pStyle w:val="Paragraphedeliste"/>
-        <w:numPr>
-          <w:ilvl w:val="0"/>
-          <w:numId w:val="2"/>
-        </w:numPr>
-        <w:spacing w:after="60"/>
-      </w:pPr>
-      <w:r>
-        <w:t>Valeurs aberrantes</w:t>
-      </w:r>
-    </w:p>
-    <w:p>
-      <w:pPr>
-        <w:pStyle w:val="Paragraphedeliste"/>
-        <w:numPr>
-          <w:ilvl w:val="0"/>
-          <w:numId w:val="2"/>
-        </w:numPr>
-        <w:spacing w:after="60"/>
-      </w:pPr>
-      <w:r>
-        <w:t>Désynchronisation</w:t>
-      </w:r>
-    </w:p>
-    <w:p>
-      <w:pPr>
-        <w:pStyle w:val="Paragraphedeliste"/>
-        <w:numPr>
-          <w:ilvl w:val="0"/>
-          <w:numId w:val="2"/>
-        </w:numPr>
-        <w:spacing w:after="60"/>
-      </w:pPr>
-      <w:r>
-        <w:t>Doublons</w:t>
-      </w:r>
-    </w:p>
-    <w:p>
-      <w:pPr>
-        <w:spacing w:after="140" w:line="276" w:lineRule="auto"/>
-      </w:pPr>
-      <w:r>
-        <w:t>Aucune décision n'est prise avec des données jugées incohérentes.</w:t>
+        <w:t>Il transforme les données brutes en informations exploitables :</w:t>
+      </w:r>
+    </w:p>
+    <w:p>
+      <w:pPr>
+        <w:pStyle w:val="Paragraphedeliste"/>
+        <w:numPr>
+          <w:ilvl w:val="0"/>
+          <w:numId w:val="2"/>
+        </w:numPr>
+        <w:spacing w:after="60"/>
+      </w:pPr>
+      <w:r>
+        <w:t>Indicateurs techniques</w:t>
+      </w:r>
+    </w:p>
+    <w:p>
+      <w:pPr>
+        <w:pStyle w:val="Paragraphedeliste"/>
+        <w:numPr>
+          <w:ilvl w:val="0"/>
+          <w:numId w:val="2"/>
+        </w:numPr>
+        <w:spacing w:after="60"/>
+      </w:pPr>
+      <w:r>
+        <w:t>Volatilité</w:t>
+      </w:r>
+    </w:p>
+    <w:p>
+      <w:pPr>
+        <w:pStyle w:val="Paragraphedeliste"/>
+        <w:numPr>
+          <w:ilvl w:val="0"/>
+          <w:numId w:val="2"/>
+        </w:numPr>
+        <w:spacing w:after="60"/>
+      </w:pPr>
+      <w:proofErr w:type="spellStart"/>
+      <w:r>
+        <w:t>Momentum</w:t>
+      </w:r>
+      <w:proofErr w:type="spellEnd"/>
+    </w:p>
+    <w:p>
+      <w:pPr>
+        <w:pStyle w:val="Paragraphedeliste"/>
+        <w:numPr>
+          <w:ilvl w:val="0"/>
+          <w:numId w:val="2"/>
+        </w:numPr>
+        <w:spacing w:after="60"/>
+      </w:pPr>
+      <w:r>
+        <w:t>Profondeur du carnet</w:t>
+      </w:r>
+    </w:p>
+    <w:p>
+      <w:pPr>
+        <w:pStyle w:val="Paragraphedeliste"/>
+        <w:numPr>
+          <w:ilvl w:val="0"/>
+          <w:numId w:val="2"/>
+        </w:numPr>
+        <w:spacing w:after="60"/>
+      </w:pPr>
+      <w:r>
+        <w:t>Déséquilibre acheteurs/vendeurs</w:t>
+      </w:r>
+    </w:p>
+    <w:p>
+      <w:pPr>
+        <w:pStyle w:val="Paragraphedeliste"/>
+        <w:numPr>
+          <w:ilvl w:val="0"/>
+          <w:numId w:val="2"/>
+        </w:numPr>
+        <w:spacing w:after="60"/>
+      </w:pPr>
+      <w:r>
+        <w:t>Corrélations</w:t>
+      </w:r>
+    </w:p>
+    <w:p>
+      <w:pPr>
+        <w:pStyle w:val="Paragraphedeliste"/>
+        <w:numPr>
+          <w:ilvl w:val="0"/>
+          <w:numId w:val="2"/>
+        </w:numPr>
+        <w:spacing w:after="60"/>
+      </w:pPr>
+      <w:r>
+        <w:t>Régimes de volatilité</w:t>
       </w:r>
     </w:p>
     <w:p>
@@ -2111,7 +2265,7 @@
           <w:sz w:val="18"/>
           <w:szCs w:val="18"/>
         </w:rPr>
-        <w:t>MODULE 3</w:t>
+        <w:t>MODULE 4</w:t>
       </w:r>
     </w:p>
     <w:p>
@@ -2127,7 +2281,7 @@
           <w:sz w:val="22"/>
           <w:szCs w:val="22"/>
         </w:rPr>
-        <w:t>Feature Engineering</w:t>
+        <w:t>IA de marché</w:t>
       </w:r>
     </w:p>
     <w:p>
@@ -2135,98 +2289,111 @@
         <w:spacing w:after="140" w:line="276" w:lineRule="auto"/>
       </w:pPr>
       <w:r>
-        <w:t>Il transforme les données brutes en informations exploitables :</w:t>
-      </w:r>
-    </w:p>
-    <w:p>
-      <w:pPr>
-        <w:pStyle w:val="Paragraphedeliste"/>
-        <w:numPr>
-          <w:ilvl w:val="0"/>
-          <w:numId w:val="2"/>
-        </w:numPr>
-        <w:spacing w:after="60"/>
-      </w:pPr>
-      <w:r>
-        <w:t>Indicateurs techniques</w:t>
-      </w:r>
-    </w:p>
-    <w:p>
-      <w:pPr>
-        <w:pStyle w:val="Paragraphedeliste"/>
-        <w:numPr>
-          <w:ilvl w:val="0"/>
-          <w:numId w:val="2"/>
-        </w:numPr>
-        <w:spacing w:after="60"/>
-      </w:pPr>
-      <w:r>
-        <w:t>Volatilité</w:t>
-      </w:r>
-    </w:p>
-    <w:p>
-      <w:pPr>
-        <w:pStyle w:val="Paragraphedeliste"/>
-        <w:numPr>
-          <w:ilvl w:val="0"/>
-          <w:numId w:val="2"/>
-        </w:numPr>
-        <w:spacing w:after="60"/>
-      </w:pPr>
-      <w:r>
-        <w:t>Momentum</w:t>
-      </w:r>
-    </w:p>
-    <w:p>
-      <w:pPr>
-        <w:pStyle w:val="Paragraphedeliste"/>
-        <w:numPr>
-          <w:ilvl w:val="0"/>
-          <w:numId w:val="2"/>
-        </w:numPr>
-        <w:spacing w:after="60"/>
-      </w:pPr>
-      <w:r>
-        <w:t>Profondeur du carnet</w:t>
-      </w:r>
-    </w:p>
-    <w:p>
-      <w:pPr>
-        <w:pStyle w:val="Paragraphedeliste"/>
-        <w:numPr>
-          <w:ilvl w:val="0"/>
-          <w:numId w:val="2"/>
-        </w:numPr>
-        <w:spacing w:after="60"/>
-      </w:pPr>
-      <w:r>
-        <w:t>Déséquilibre acheteurs/vendeurs</w:t>
-      </w:r>
-    </w:p>
-    <w:p>
-      <w:pPr>
-        <w:pStyle w:val="Paragraphedeliste"/>
-        <w:numPr>
-          <w:ilvl w:val="0"/>
-          <w:numId w:val="2"/>
-        </w:numPr>
-        <w:spacing w:after="60"/>
-      </w:pPr>
-      <w:r>
-        <w:t>Corrélations</w:t>
-      </w:r>
-    </w:p>
-    <w:p>
-      <w:pPr>
-        <w:pStyle w:val="Paragraphedeliste"/>
-        <w:numPr>
-          <w:ilvl w:val="0"/>
-          <w:numId w:val="2"/>
-        </w:numPr>
-        <w:spacing w:after="60"/>
-      </w:pPr>
-      <w:r>
-        <w:t>Régimes de volatilité</w:t>
+        <w:t>Mission : comprendre le marché. Elle identifie :</w:t>
+      </w:r>
+    </w:p>
+    <w:p>
+      <w:pPr>
+        <w:pStyle w:val="Paragraphedeliste"/>
+        <w:numPr>
+          <w:ilvl w:val="0"/>
+          <w:numId w:val="2"/>
+        </w:numPr>
+        <w:spacing w:after="60"/>
+      </w:pPr>
+      <w:r>
+        <w:t>Range</w:t>
+      </w:r>
+    </w:p>
+    <w:p>
+      <w:pPr>
+        <w:pStyle w:val="Paragraphedeliste"/>
+        <w:numPr>
+          <w:ilvl w:val="0"/>
+          <w:numId w:val="2"/>
+        </w:numPr>
+        <w:spacing w:after="60"/>
+      </w:pPr>
+      <w:r>
+        <w:t>Bull</w:t>
+      </w:r>
+    </w:p>
+    <w:p>
+      <w:pPr>
+        <w:pStyle w:val="Paragraphedeliste"/>
+        <w:numPr>
+          <w:ilvl w:val="0"/>
+          <w:numId w:val="2"/>
+        </w:numPr>
+        <w:spacing w:after="60"/>
+      </w:pPr>
+      <w:proofErr w:type="spellStart"/>
+      <w:r>
+        <w:t>Bear</w:t>
+      </w:r>
+      <w:proofErr w:type="spellEnd"/>
+    </w:p>
+    <w:p>
+      <w:pPr>
+        <w:pStyle w:val="Paragraphedeliste"/>
+        <w:numPr>
+          <w:ilvl w:val="0"/>
+          <w:numId w:val="2"/>
+        </w:numPr>
+        <w:spacing w:after="60"/>
+      </w:pPr>
+      <w:r>
+        <w:t>Forte volatilité</w:t>
+      </w:r>
+    </w:p>
+    <w:p>
+      <w:pPr>
+        <w:pStyle w:val="Paragraphedeliste"/>
+        <w:numPr>
+          <w:ilvl w:val="0"/>
+          <w:numId w:val="2"/>
+        </w:numPr>
+        <w:spacing w:after="60"/>
+      </w:pPr>
+      <w:r>
+        <w:t>Faible volatilité</w:t>
+      </w:r>
+    </w:p>
+    <w:p>
+      <w:pPr>
+        <w:pStyle w:val="Paragraphedeliste"/>
+        <w:numPr>
+          <w:ilvl w:val="0"/>
+          <w:numId w:val="2"/>
+        </w:numPr>
+        <w:spacing w:after="60"/>
+      </w:pPr>
+      <w:r>
+        <w:t>Capitulation</w:t>
+      </w:r>
+    </w:p>
+    <w:p>
+      <w:pPr>
+        <w:pStyle w:val="Paragraphedeliste"/>
+        <w:numPr>
+          <w:ilvl w:val="0"/>
+          <w:numId w:val="2"/>
+        </w:numPr>
+        <w:spacing w:after="60"/>
+      </w:pPr>
+      <w:proofErr w:type="spellStart"/>
+      <w:r>
+        <w:t>Euphoria</w:t>
+      </w:r>
+      <w:proofErr w:type="spellEnd"/>
+    </w:p>
+    <w:p>
+      <w:pPr>
+        <w:spacing w:after="140" w:line="276" w:lineRule="auto"/>
+      </w:pPr>
+      <w:r>
+        <w:lastRenderedPageBreak/>
+        <w:t>Elle renvoie une distribution de probabilités plutôt qu'une réponse unique.</w:t>
       </w:r>
     </w:p>
     <w:p>
@@ -2242,7 +2409,7 @@
           <w:sz w:val="18"/>
           <w:szCs w:val="18"/>
         </w:rPr>
-        <w:t>MODULE 4</w:t>
+        <w:t>MODULE 5</w:t>
       </w:r>
     </w:p>
     <w:p>
@@ -2258,7 +2425,7 @@
           <w:sz w:val="22"/>
           <w:szCs w:val="22"/>
         </w:rPr>
-        <w:t>IA de marché</w:t>
+        <w:t>Bibliothèque de stratégies</w:t>
       </w:r>
     </w:p>
     <w:p>
@@ -2266,98 +2433,122 @@
         <w:spacing w:after="140" w:line="276" w:lineRule="auto"/>
       </w:pPr>
       <w:r>
-        <w:t>Mission : comprendre le marché. Elle identifie :</w:t>
-      </w:r>
-    </w:p>
-    <w:p>
-      <w:pPr>
-        <w:pStyle w:val="Paragraphedeliste"/>
-        <w:numPr>
-          <w:ilvl w:val="0"/>
-          <w:numId w:val="2"/>
-        </w:numPr>
-        <w:spacing w:after="60"/>
-      </w:pPr>
-      <w:r>
-        <w:t>Range</w:t>
-      </w:r>
-    </w:p>
-    <w:p>
-      <w:pPr>
-        <w:pStyle w:val="Paragraphedeliste"/>
-        <w:numPr>
-          <w:ilvl w:val="0"/>
-          <w:numId w:val="2"/>
-        </w:numPr>
-        <w:spacing w:after="60"/>
-      </w:pPr>
-      <w:r>
-        <w:t>Bull</w:t>
-      </w:r>
-    </w:p>
-    <w:p>
-      <w:pPr>
-        <w:pStyle w:val="Paragraphedeliste"/>
-        <w:numPr>
-          <w:ilvl w:val="0"/>
-          <w:numId w:val="2"/>
-        </w:numPr>
-        <w:spacing w:after="60"/>
-      </w:pPr>
-      <w:r>
-        <w:t>Bear</w:t>
-      </w:r>
-    </w:p>
-    <w:p>
-      <w:pPr>
-        <w:pStyle w:val="Paragraphedeliste"/>
-        <w:numPr>
-          <w:ilvl w:val="0"/>
-          <w:numId w:val="2"/>
-        </w:numPr>
-        <w:spacing w:after="60"/>
-      </w:pPr>
-      <w:r>
-        <w:t>Forte volatilité</w:t>
-      </w:r>
-    </w:p>
-    <w:p>
-      <w:pPr>
-        <w:pStyle w:val="Paragraphedeliste"/>
-        <w:numPr>
-          <w:ilvl w:val="0"/>
-          <w:numId w:val="2"/>
-        </w:numPr>
-        <w:spacing w:after="60"/>
-      </w:pPr>
-      <w:r>
-        <w:t>Faible volatilité</w:t>
-      </w:r>
-    </w:p>
-    <w:p>
-      <w:pPr>
-        <w:pStyle w:val="Paragraphedeliste"/>
-        <w:numPr>
-          <w:ilvl w:val="0"/>
-          <w:numId w:val="2"/>
-        </w:numPr>
-        <w:spacing w:after="60"/>
-      </w:pPr>
-      <w:r>
-        <w:t>Capitulation</w:t>
-      </w:r>
-    </w:p>
-    <w:p>
-      <w:pPr>
-        <w:pStyle w:val="Paragraphedeliste"/>
-        <w:numPr>
-          <w:ilvl w:val="0"/>
-          <w:numId w:val="2"/>
-        </w:numPr>
-        <w:spacing w:after="60"/>
-      </w:pPr>
-      <w:r>
-        <w:t>Euphoria</w:t>
+        <w:t>Chaque stratégie est indépendante. Exemples :</w:t>
+      </w:r>
+    </w:p>
+    <w:p>
+      <w:pPr>
+        <w:pStyle w:val="Paragraphedeliste"/>
+        <w:numPr>
+          <w:ilvl w:val="0"/>
+          <w:numId w:val="2"/>
+        </w:numPr>
+        <w:spacing w:after="60"/>
+      </w:pPr>
+      <w:proofErr w:type="spellStart"/>
+      <w:r>
+        <w:t>Grid</w:t>
+      </w:r>
+      <w:proofErr w:type="spellEnd"/>
+      <w:r>
+        <w:t xml:space="preserve"> adaptatif</w:t>
+      </w:r>
+    </w:p>
+    <w:p>
+      <w:pPr>
+        <w:pStyle w:val="Paragraphedeliste"/>
+        <w:numPr>
+          <w:ilvl w:val="0"/>
+          <w:numId w:val="2"/>
+        </w:numPr>
+        <w:spacing w:after="60"/>
+      </w:pPr>
+      <w:r>
+        <w:t xml:space="preserve">Trend </w:t>
+      </w:r>
+      <w:proofErr w:type="spellStart"/>
+      <w:r>
+        <w:t>Following</w:t>
+      </w:r>
+      <w:proofErr w:type="spellEnd"/>
+    </w:p>
+    <w:p>
+      <w:pPr>
+        <w:pStyle w:val="Paragraphedeliste"/>
+        <w:numPr>
+          <w:ilvl w:val="0"/>
+          <w:numId w:val="2"/>
+        </w:numPr>
+        <w:spacing w:after="60"/>
+      </w:pPr>
+      <w:proofErr w:type="spellStart"/>
+      <w:r>
+        <w:t>Mean</w:t>
+      </w:r>
+      <w:proofErr w:type="spellEnd"/>
+      <w:r>
+        <w:t xml:space="preserve"> </w:t>
+      </w:r>
+      <w:proofErr w:type="spellStart"/>
+      <w:r>
+        <w:t>Reversion</w:t>
+      </w:r>
+      <w:proofErr w:type="spellEnd"/>
+    </w:p>
+    <w:p>
+      <w:pPr>
+        <w:pStyle w:val="Paragraphedeliste"/>
+        <w:numPr>
+          <w:ilvl w:val="0"/>
+          <w:numId w:val="2"/>
+        </w:numPr>
+        <w:spacing w:after="60"/>
+      </w:pPr>
+      <w:proofErr w:type="spellStart"/>
+      <w:r>
+        <w:t>Breakout</w:t>
+      </w:r>
+      <w:proofErr w:type="spellEnd"/>
+    </w:p>
+    <w:p>
+      <w:pPr>
+        <w:pStyle w:val="Paragraphedeliste"/>
+        <w:numPr>
+          <w:ilvl w:val="0"/>
+          <w:numId w:val="2"/>
+        </w:numPr>
+        <w:spacing w:after="60"/>
+      </w:pPr>
+      <w:r>
+        <w:t>Swing Trading</w:t>
+      </w:r>
+    </w:p>
+    <w:p>
+      <w:pPr>
+        <w:pStyle w:val="Paragraphedeliste"/>
+        <w:numPr>
+          <w:ilvl w:val="0"/>
+          <w:numId w:val="2"/>
+        </w:numPr>
+        <w:spacing w:after="60"/>
+      </w:pPr>
+      <w:proofErr w:type="spellStart"/>
+      <w:r>
+        <w:t>Scalping</w:t>
+      </w:r>
+      <w:proofErr w:type="spellEnd"/>
+    </w:p>
+    <w:p>
+      <w:pPr>
+        <w:pStyle w:val="Paragraphedeliste"/>
+        <w:numPr>
+          <w:ilvl w:val="0"/>
+          <w:numId w:val="2"/>
+        </w:numPr>
+        <w:spacing w:after="60"/>
+      </w:pPr>
+      <w:r>
+        <w:t>Arbitrage (si l'infrastructure le permet)</w:t>
       </w:r>
     </w:p>
     <w:p>
@@ -2365,8 +2556,7 @@
         <w:spacing w:after="140" w:line="276" w:lineRule="auto"/>
       </w:pPr>
       <w:r>
-        <w:lastRenderedPageBreak/>
-        <w:t>Elle renvoie une distribution de probabilités plutôt qu'une réponse unique.</w:t>
+        <w:t>Chaque stratégie produit : un sens (achat, vente ou attente), un niveau de confiance, un ratio risque/rendement estimé et un horizon temporel.</w:t>
       </w:r>
     </w:p>
     <w:p>
@@ -2382,7 +2572,7 @@
           <w:sz w:val="18"/>
           <w:szCs w:val="18"/>
         </w:rPr>
-        <w:t>MODULE 5</w:t>
+        <w:t>MODULE 6</w:t>
       </w:r>
     </w:p>
     <w:p>
@@ -2398,7 +2588,7 @@
           <w:sz w:val="22"/>
           <w:szCs w:val="22"/>
         </w:rPr>
-        <w:t>Bibliothèque de stratégies</w:t>
+        <w:t>Conseil IA</w:t>
       </w:r>
     </w:p>
     <w:p>
@@ -2406,101 +2596,72 @@
         <w:spacing w:after="140" w:line="276" w:lineRule="auto"/>
       </w:pPr>
       <w:r>
-        <w:t>Chaque stratégie est indépendante. Exemples :</w:t>
-      </w:r>
-    </w:p>
-    <w:p>
-      <w:pPr>
-        <w:pStyle w:val="Paragraphedeliste"/>
-        <w:numPr>
-          <w:ilvl w:val="0"/>
-          <w:numId w:val="2"/>
-        </w:numPr>
-        <w:spacing w:after="60"/>
-      </w:pPr>
-      <w:r>
-        <w:t>Grid adaptatif</w:t>
-      </w:r>
-    </w:p>
-    <w:p>
-      <w:pPr>
-        <w:pStyle w:val="Paragraphedeliste"/>
-        <w:numPr>
-          <w:ilvl w:val="0"/>
-          <w:numId w:val="2"/>
-        </w:numPr>
-        <w:spacing w:after="60"/>
-      </w:pPr>
-      <w:r>
-        <w:t>Trend Following</w:t>
-      </w:r>
-    </w:p>
-    <w:p>
-      <w:pPr>
-        <w:pStyle w:val="Paragraphedeliste"/>
-        <w:numPr>
-          <w:ilvl w:val="0"/>
-          <w:numId w:val="2"/>
-        </w:numPr>
-        <w:spacing w:after="60"/>
-      </w:pPr>
-      <w:r>
-        <w:t>Mean Reversion</w:t>
-      </w:r>
-    </w:p>
-    <w:p>
-      <w:pPr>
-        <w:pStyle w:val="Paragraphedeliste"/>
-        <w:numPr>
-          <w:ilvl w:val="0"/>
-          <w:numId w:val="2"/>
-        </w:numPr>
-        <w:spacing w:after="60"/>
-      </w:pPr>
-      <w:r>
-        <w:t>Breakout</w:t>
-      </w:r>
-    </w:p>
-    <w:p>
-      <w:pPr>
-        <w:pStyle w:val="Paragraphedeliste"/>
-        <w:numPr>
-          <w:ilvl w:val="0"/>
-          <w:numId w:val="2"/>
-        </w:numPr>
-        <w:spacing w:after="60"/>
-      </w:pPr>
-      <w:r>
-        <w:t>Swing Trading</w:t>
-      </w:r>
-    </w:p>
-    <w:p>
-      <w:pPr>
-        <w:pStyle w:val="Paragraphedeliste"/>
-        <w:numPr>
-          <w:ilvl w:val="0"/>
-          <w:numId w:val="2"/>
-        </w:numPr>
-        <w:spacing w:after="60"/>
-      </w:pPr>
-      <w:r>
-        <w:t>Scalpin</w:t>
-      </w:r>
-      <w:r>
-        <w:t>g</w:t>
-      </w:r>
-    </w:p>
-    <w:p>
-      <w:pPr>
-        <w:pStyle w:val="Paragraphedeliste"/>
-        <w:numPr>
-          <w:ilvl w:val="0"/>
-          <w:numId w:val="2"/>
-        </w:numPr>
-        <w:spacing w:after="60"/>
-      </w:pPr>
-      <w:r>
-        <w:t>Arbitrage (si l'infrastructure le permet)</w:t>
+        <w:t>Chaque agent vote. Exemple :</w:t>
+      </w:r>
+    </w:p>
+    <w:p>
+      <w:pPr>
+        <w:pStyle w:val="Paragraphedeliste"/>
+        <w:numPr>
+          <w:ilvl w:val="0"/>
+          <w:numId w:val="2"/>
+        </w:numPr>
+        <w:spacing w:after="60"/>
+      </w:pPr>
+      <w:r>
+        <w:t>Analyste Marché</w:t>
+      </w:r>
+    </w:p>
+    <w:p>
+      <w:pPr>
+        <w:pStyle w:val="Paragraphedeliste"/>
+        <w:numPr>
+          <w:ilvl w:val="0"/>
+          <w:numId w:val="2"/>
+        </w:numPr>
+        <w:spacing w:after="60"/>
+      </w:pPr>
+      <w:r>
+        <w:t>Trader</w:t>
+      </w:r>
+    </w:p>
+    <w:p>
+      <w:pPr>
+        <w:pStyle w:val="Paragraphedeliste"/>
+        <w:numPr>
+          <w:ilvl w:val="0"/>
+          <w:numId w:val="2"/>
+        </w:numPr>
+        <w:spacing w:after="60"/>
+      </w:pPr>
+      <w:r>
+        <w:t>Gestionnaire du risque</w:t>
+      </w:r>
+    </w:p>
+    <w:p>
+      <w:pPr>
+        <w:pStyle w:val="Paragraphedeliste"/>
+        <w:numPr>
+          <w:ilvl w:val="0"/>
+          <w:numId w:val="2"/>
+        </w:numPr>
+        <w:spacing w:after="60"/>
+      </w:pPr>
+      <w:r>
+        <w:t>Coach</w:t>
+      </w:r>
+    </w:p>
+    <w:p>
+      <w:pPr>
+        <w:pStyle w:val="Paragraphedeliste"/>
+        <w:numPr>
+          <w:ilvl w:val="0"/>
+          <w:numId w:val="2"/>
+        </w:numPr>
+        <w:spacing w:after="60"/>
+      </w:pPr>
+      <w:r>
+        <w:t>Chercheur</w:t>
       </w:r>
     </w:p>
     <w:p>
@@ -2508,7 +2669,7 @@
         <w:spacing w:after="140" w:line="276" w:lineRule="auto"/>
       </w:pPr>
       <w:r>
-        <w:t>Chaque stratégie produit : un sens (achat, vente ou attente), un niveau de confiance, un ratio risque/rendement estimé et un horizon temporel.</w:t>
+        <w:t>Le système combine ces avis avec des règles explicites. Le gestionnaire du risque conserve un droit de veto.</w:t>
       </w:r>
     </w:p>
     <w:p>
@@ -2524,7 +2685,7 @@
           <w:sz w:val="18"/>
           <w:szCs w:val="18"/>
         </w:rPr>
-        <w:t>MODULE 6</w:t>
+        <w:t>MODULE 7</w:t>
       </w:r>
     </w:p>
     <w:p>
@@ -2540,7 +2701,7 @@
           <w:sz w:val="22"/>
           <w:szCs w:val="22"/>
         </w:rPr>
-        <w:t>Conseil IA</w:t>
+        <w:t>Gestion du risque</w:t>
       </w:r>
     </w:p>
     <w:p>
@@ -2548,72 +2709,122 @@
         <w:spacing w:after="140" w:line="276" w:lineRule="auto"/>
       </w:pPr>
       <w:r>
-        <w:t>Chaque agent vote. Exemple :</w:t>
-      </w:r>
-    </w:p>
-    <w:p>
-      <w:pPr>
-        <w:pStyle w:val="Paragraphedeliste"/>
-        <w:numPr>
-          <w:ilvl w:val="0"/>
-          <w:numId w:val="2"/>
-        </w:numPr>
-        <w:spacing w:after="60"/>
-      </w:pPr>
-      <w:r>
-        <w:t>Analyste Marché</w:t>
-      </w:r>
-    </w:p>
-    <w:p>
-      <w:pPr>
-        <w:pStyle w:val="Paragraphedeliste"/>
-        <w:numPr>
-          <w:ilvl w:val="0"/>
-          <w:numId w:val="2"/>
-        </w:numPr>
-        <w:spacing w:after="60"/>
-      </w:pPr>
-      <w:r>
-        <w:t>Trader</w:t>
-      </w:r>
-    </w:p>
-    <w:p>
-      <w:pPr>
-        <w:pStyle w:val="Paragraphedeliste"/>
-        <w:numPr>
-          <w:ilvl w:val="0"/>
-          <w:numId w:val="2"/>
-        </w:numPr>
-        <w:spacing w:after="60"/>
-      </w:pPr>
-      <w:r>
-        <w:t>Gestionnaire du risque</w:t>
-      </w:r>
-    </w:p>
-    <w:p>
-      <w:pPr>
-        <w:pStyle w:val="Paragraphedeliste"/>
-        <w:numPr>
-          <w:ilvl w:val="0"/>
-          <w:numId w:val="2"/>
-        </w:numPr>
-        <w:spacing w:after="60"/>
-      </w:pPr>
-      <w:r>
-        <w:t>Coach</w:t>
-      </w:r>
-    </w:p>
-    <w:p>
-      <w:pPr>
-        <w:pStyle w:val="Paragraphedeliste"/>
-        <w:numPr>
-          <w:ilvl w:val="0"/>
-          <w:numId w:val="2"/>
-        </w:numPr>
-        <w:spacing w:after="60"/>
-      </w:pPr>
-      <w:r>
-        <w:t>Chercheur</w:t>
+        <w:t>C'est le module prioritaire. Il calcule :</w:t>
+      </w:r>
+    </w:p>
+    <w:p>
+      <w:pPr>
+        <w:pStyle w:val="Paragraphedeliste"/>
+        <w:numPr>
+          <w:ilvl w:val="0"/>
+          <w:numId w:val="2"/>
+        </w:numPr>
+        <w:spacing w:after="60"/>
+      </w:pPr>
+      <w:r>
+        <w:t>Exposition</w:t>
+      </w:r>
+    </w:p>
+    <w:p>
+      <w:pPr>
+        <w:pStyle w:val="Paragraphedeliste"/>
+        <w:numPr>
+          <w:ilvl w:val="0"/>
+          <w:numId w:val="2"/>
+        </w:numPr>
+        <w:spacing w:after="60"/>
+      </w:pPr>
+      <w:proofErr w:type="spellStart"/>
+      <w:r>
+        <w:t>Drawdown</w:t>
+      </w:r>
+      <w:proofErr w:type="spellEnd"/>
+    </w:p>
+    <w:p>
+      <w:pPr>
+        <w:pStyle w:val="Paragraphedeliste"/>
+        <w:numPr>
+          <w:ilvl w:val="0"/>
+          <w:numId w:val="2"/>
+        </w:numPr>
+        <w:spacing w:after="60"/>
+      </w:pPr>
+      <w:proofErr w:type="spellStart"/>
+      <w:r>
+        <w:t>VaR</w:t>
+      </w:r>
+      <w:proofErr w:type="spellEnd"/>
+      <w:r>
+        <w:t xml:space="preserve"> (Value at </w:t>
+      </w:r>
+      <w:proofErr w:type="spellStart"/>
+      <w:r>
+        <w:t>Risk</w:t>
+      </w:r>
+      <w:proofErr w:type="spellEnd"/>
+      <w:r>
+        <w:t>)</w:t>
+      </w:r>
+    </w:p>
+    <w:p>
+      <w:pPr>
+        <w:pStyle w:val="Paragraphedeliste"/>
+        <w:numPr>
+          <w:ilvl w:val="0"/>
+          <w:numId w:val="2"/>
+        </w:numPr>
+        <w:spacing w:after="60"/>
+      </w:pPr>
+      <w:proofErr w:type="spellStart"/>
+      <w:r>
+        <w:t>CVaR</w:t>
+      </w:r>
+      <w:proofErr w:type="spellEnd"/>
+      <w:r>
+        <w:t xml:space="preserve"> (</w:t>
+      </w:r>
+      <w:proofErr w:type="spellStart"/>
+      <w:r>
+        <w:t>Conditional</w:t>
+      </w:r>
+      <w:proofErr w:type="spellEnd"/>
+      <w:r>
+        <w:t xml:space="preserve"> </w:t>
+      </w:r>
+      <w:proofErr w:type="spellStart"/>
+      <w:r>
+        <w:t>VaR</w:t>
+      </w:r>
+      <w:proofErr w:type="spellEnd"/>
+      <w:r>
+        <w:t>)</w:t>
+      </w:r>
+    </w:p>
+    <w:p>
+      <w:pPr>
+        <w:pStyle w:val="Paragraphedeliste"/>
+        <w:numPr>
+          <w:ilvl w:val="0"/>
+          <w:numId w:val="2"/>
+        </w:numPr>
+        <w:spacing w:after="60"/>
+      </w:pPr>
+      <w:r>
+        <w:t>Concentration</w:t>
+      </w:r>
+    </w:p>
+    <w:bookmarkEnd w:id="4"/>
+    <w:p>
+      <w:pPr>
+        <w:pStyle w:val="Paragraphedeliste"/>
+        <w:numPr>
+          <w:ilvl w:val="0"/>
+          <w:numId w:val="2"/>
+        </w:numPr>
+        <w:spacing w:after="60"/>
+      </w:pPr>
+      <w:r>
+        <w:t>Corrélation dynamique</w:t>
       </w:r>
     </w:p>
     <w:p>
@@ -2621,7 +2832,7 @@
         <w:spacing w:after="140" w:line="276" w:lineRule="auto"/>
       </w:pPr>
       <w:r>
-        <w:t>Le système combine ces avis avec des règles explicites. Le gestionnaire du risque conserve un droit de veto.</w:t>
+        <w:t>Il effectue également des stress tests inspirés de scénarios extrêmes (forte volatilité, perte de liquidité, défaillance d'une plateforme, etc.).</w:t>
       </w:r>
     </w:p>
     <w:p>
@@ -2637,7 +2848,7 @@
           <w:sz w:val="18"/>
           <w:szCs w:val="18"/>
         </w:rPr>
-        <w:t>MODULE 7</w:t>
+        <w:t>MODULE 8</w:t>
       </w:r>
     </w:p>
     <w:p>
@@ -2653,7 +2864,7 @@
           <w:sz w:val="22"/>
           <w:szCs w:val="22"/>
         </w:rPr>
-        <w:t>Gestion du risque</w:t>
+        <w:t>Exécution intelligente</w:t>
       </w:r>
     </w:p>
     <w:p>
@@ -2661,85 +2872,47 @@
         <w:spacing w:after="140" w:line="276" w:lineRule="auto"/>
       </w:pPr>
       <w:r>
-        <w:t>C'est le module prioritaire. Il calcule :</w:t>
-      </w:r>
-    </w:p>
-    <w:p>
-      <w:pPr>
-        <w:pStyle w:val="Paragraphedeliste"/>
-        <w:numPr>
-          <w:ilvl w:val="0"/>
-          <w:numId w:val="2"/>
-        </w:numPr>
-        <w:spacing w:after="60"/>
-      </w:pPr>
-      <w:r>
-        <w:t>Exposition</w:t>
-      </w:r>
-    </w:p>
-    <w:p>
-      <w:pPr>
-        <w:pStyle w:val="Paragraphedeliste"/>
-        <w:numPr>
-          <w:ilvl w:val="0"/>
-          <w:numId w:val="2"/>
-        </w:numPr>
-        <w:spacing w:after="60"/>
-      </w:pPr>
-      <w:r>
-        <w:t>Drawdown</w:t>
-      </w:r>
-    </w:p>
-    <w:p>
-      <w:pPr>
-        <w:pStyle w:val="Paragraphedeliste"/>
-        <w:numPr>
-          <w:ilvl w:val="0"/>
-          <w:numId w:val="2"/>
-        </w:numPr>
-        <w:spacing w:after="60"/>
-      </w:pPr>
-      <w:r>
-        <w:t>VaR (Value at Risk)</w:t>
-      </w:r>
-    </w:p>
-    <w:p>
-      <w:pPr>
-        <w:pStyle w:val="Paragraphedeliste"/>
-        <w:numPr>
-          <w:ilvl w:val="0"/>
-          <w:numId w:val="2"/>
-        </w:numPr>
-        <w:spacing w:after="60"/>
-      </w:pPr>
-      <w:r>
-        <w:t>CVaR (Conditional VaR)</w:t>
-      </w:r>
-    </w:p>
-    <w:p>
-      <w:pPr>
-        <w:pStyle w:val="Paragraphedeliste"/>
-        <w:numPr>
-          <w:ilvl w:val="0"/>
-          <w:numId w:val="2"/>
-        </w:numPr>
-        <w:spacing w:after="60"/>
-      </w:pPr>
-      <w:r>
-        <w:t>Concentration</w:t>
-      </w:r>
-    </w:p>
-    <w:p>
-      <w:pPr>
-        <w:pStyle w:val="Paragraphedeliste"/>
-        <w:numPr>
-          <w:ilvl w:val="0"/>
-          <w:numId w:val="2"/>
-        </w:numPr>
-        <w:spacing w:after="60"/>
-      </w:pPr>
-      <w:r>
-        <w:t>Corrélation dynamique</w:t>
+        <w:t>Choix automatique :</w:t>
+      </w:r>
+    </w:p>
+    <w:p>
+      <w:pPr>
+        <w:pStyle w:val="Paragraphedeliste"/>
+        <w:numPr>
+          <w:ilvl w:val="0"/>
+          <w:numId w:val="2"/>
+        </w:numPr>
+        <w:spacing w:after="60"/>
+      </w:pPr>
+      <w:r>
+        <w:t>Ordre limite</w:t>
+      </w:r>
+    </w:p>
+    <w:p>
+      <w:pPr>
+        <w:pStyle w:val="Paragraphedeliste"/>
+        <w:numPr>
+          <w:ilvl w:val="0"/>
+          <w:numId w:val="2"/>
+        </w:numPr>
+        <w:spacing w:after="60"/>
+      </w:pPr>
+      <w:r>
+        <w:t>Ordre au marché</w:t>
+      </w:r>
+    </w:p>
+    <w:p>
+      <w:pPr>
+        <w:pStyle w:val="Paragraphedeliste"/>
+        <w:numPr>
+          <w:ilvl w:val="0"/>
+          <w:numId w:val="2"/>
+        </w:numPr>
+        <w:spacing w:after="60"/>
+      </w:pPr>
+      <w:r>
+        <w:lastRenderedPageBreak/>
+        <w:t>Exécution fractionnée</w:t>
       </w:r>
     </w:p>
     <w:p>
@@ -2747,7 +2920,15 @@
         <w:spacing w:after="140" w:line="276" w:lineRule="auto"/>
       </w:pPr>
       <w:r>
-        <w:t>Il effectue également des stress tests inspirés de scénarios extrêmes (forte volatilité, perte de liquidité, défaillance d'une plateforme, etc.).</w:t>
+        <w:t xml:space="preserve">Il cherche à réduire le </w:t>
+      </w:r>
+      <w:proofErr w:type="spellStart"/>
+      <w:r>
+        <w:t>slippage</w:t>
+      </w:r>
+      <w:proofErr w:type="spellEnd"/>
+      <w:r>
+        <w:t>, les frais et l'impact sur le marché.</w:t>
       </w:r>
     </w:p>
     <w:p>
@@ -2763,7 +2944,7 @@
           <w:sz w:val="18"/>
           <w:szCs w:val="18"/>
         </w:rPr>
-        <w:t>MODULE 8</w:t>
+        <w:t>MODULE 9</w:t>
       </w:r>
     </w:p>
     <w:p>
@@ -2779,7 +2960,7 @@
           <w:sz w:val="22"/>
           <w:szCs w:val="22"/>
         </w:rPr>
-        <w:t>Exécution intelligente</w:t>
+        <w:t>Journal intelligent</w:t>
       </w:r>
     </w:p>
     <w:p>
@@ -2787,47 +2968,85 @@
         <w:spacing w:after="140" w:line="276" w:lineRule="auto"/>
       </w:pPr>
       <w:r>
-        <w:t>Choix automatique :</w:t>
-      </w:r>
-    </w:p>
-    <w:p>
-      <w:pPr>
-        <w:pStyle w:val="Paragraphedeliste"/>
-        <w:numPr>
-          <w:ilvl w:val="0"/>
-          <w:numId w:val="2"/>
-        </w:numPr>
-        <w:spacing w:after="60"/>
-      </w:pPr>
-      <w:r>
-        <w:t>Ordre limite</w:t>
-      </w:r>
-    </w:p>
-    <w:p>
-      <w:pPr>
-        <w:pStyle w:val="Paragraphedeliste"/>
-        <w:numPr>
-          <w:ilvl w:val="0"/>
-          <w:numId w:val="2"/>
-        </w:numPr>
-        <w:spacing w:after="60"/>
-      </w:pPr>
-      <w:r>
-        <w:t>Ordre au marché</w:t>
-      </w:r>
-    </w:p>
-    <w:p>
-      <w:pPr>
-        <w:pStyle w:val="Paragraphedeliste"/>
-        <w:numPr>
-          <w:ilvl w:val="0"/>
-          <w:numId w:val="2"/>
-        </w:numPr>
-        <w:spacing w:after="60"/>
-      </w:pPr>
-      <w:r>
-        <w:lastRenderedPageBreak/>
-        <w:t>Exécution fractionnée</w:t>
+        <w:t>Chaque décision est enregistrée avec :</w:t>
+      </w:r>
+    </w:p>
+    <w:p>
+      <w:pPr>
+        <w:pStyle w:val="Paragraphedeliste"/>
+        <w:numPr>
+          <w:ilvl w:val="0"/>
+          <w:numId w:val="2"/>
+        </w:numPr>
+        <w:spacing w:after="60"/>
+      </w:pPr>
+      <w:r>
+        <w:t>Données d'entrée</w:t>
+      </w:r>
+    </w:p>
+    <w:p>
+      <w:pPr>
+        <w:pStyle w:val="Paragraphedeliste"/>
+        <w:numPr>
+          <w:ilvl w:val="0"/>
+          <w:numId w:val="2"/>
+        </w:numPr>
+        <w:spacing w:after="60"/>
+      </w:pPr>
+      <w:r>
+        <w:t>Contexte</w:t>
+      </w:r>
+    </w:p>
+    <w:p>
+      <w:pPr>
+        <w:pStyle w:val="Paragraphedeliste"/>
+        <w:numPr>
+          <w:ilvl w:val="0"/>
+          <w:numId w:val="2"/>
+        </w:numPr>
+        <w:spacing w:after="60"/>
+      </w:pPr>
+      <w:r>
+        <w:t>Stratégie</w:t>
+      </w:r>
+    </w:p>
+    <w:p>
+      <w:pPr>
+        <w:pStyle w:val="Paragraphedeliste"/>
+        <w:numPr>
+          <w:ilvl w:val="0"/>
+          <w:numId w:val="2"/>
+        </w:numPr>
+        <w:spacing w:after="60"/>
+      </w:pPr>
+      <w:r>
+        <w:t>Score de confiance</w:t>
+      </w:r>
+    </w:p>
+    <w:p>
+      <w:pPr>
+        <w:pStyle w:val="Paragraphedeliste"/>
+        <w:numPr>
+          <w:ilvl w:val="0"/>
+          <w:numId w:val="2"/>
+        </w:numPr>
+        <w:spacing w:after="60"/>
+      </w:pPr>
+      <w:r>
+        <w:t>Décision finale</w:t>
+      </w:r>
+    </w:p>
+    <w:p>
+      <w:pPr>
+        <w:pStyle w:val="Paragraphedeliste"/>
+        <w:numPr>
+          <w:ilvl w:val="0"/>
+          <w:numId w:val="2"/>
+        </w:numPr>
+        <w:spacing w:after="60"/>
+      </w:pPr>
+      <w:r>
+        <w:t>Résultat</w:t>
       </w:r>
     </w:p>
     <w:p>
@@ -2835,7 +3054,7 @@
         <w:spacing w:after="140" w:line="276" w:lineRule="auto"/>
       </w:pPr>
       <w:r>
-        <w:t>Il cherche à réduire le slippage, les frais et l'impact sur le marché.</w:t>
+        <w:t>Le système est entièrement traçable.</w:t>
       </w:r>
     </w:p>
     <w:p>
@@ -2851,7 +3070,7 @@
           <w:sz w:val="18"/>
           <w:szCs w:val="18"/>
         </w:rPr>
-        <w:t>MODULE 9</w:t>
+        <w:t>MODULE 10</w:t>
       </w:r>
     </w:p>
     <w:p>
@@ -2867,7 +3086,7 @@
           <w:sz w:val="22"/>
           <w:szCs w:val="22"/>
         </w:rPr>
-        <w:t>Journal intelligent</w:t>
+        <w:t>Mémoire</w:t>
       </w:r>
     </w:p>
     <w:p>
@@ -2875,85 +3094,7 @@
         <w:spacing w:after="140" w:line="276" w:lineRule="auto"/>
       </w:pPr>
       <w:r>
-        <w:t>Chaque décision est enregistrée avec :</w:t>
-      </w:r>
-    </w:p>
-    <w:p>
-      <w:pPr>
-        <w:pStyle w:val="Paragraphedeliste"/>
-        <w:numPr>
-          <w:ilvl w:val="0"/>
-          <w:numId w:val="2"/>
-        </w:numPr>
-        <w:spacing w:after="60"/>
-      </w:pPr>
-      <w:r>
-        <w:t>Données d'entrée</w:t>
-      </w:r>
-    </w:p>
-    <w:p>
-      <w:pPr>
-        <w:pStyle w:val="Paragraphedeliste"/>
-        <w:numPr>
-          <w:ilvl w:val="0"/>
-          <w:numId w:val="2"/>
-        </w:numPr>
-        <w:spacing w:after="60"/>
-      </w:pPr>
-      <w:r>
-        <w:t>Contexte</w:t>
-      </w:r>
-    </w:p>
-    <w:p>
-      <w:pPr>
-        <w:pStyle w:val="Paragraphedeliste"/>
-        <w:numPr>
-          <w:ilvl w:val="0"/>
-          <w:numId w:val="2"/>
-        </w:numPr>
-        <w:spacing w:after="60"/>
-      </w:pPr>
-      <w:r>
-        <w:t>Stratégie</w:t>
-      </w:r>
-    </w:p>
-    <w:p>
-      <w:pPr>
-        <w:pStyle w:val="Paragraphedeliste"/>
-        <w:numPr>
-          <w:ilvl w:val="0"/>
-          <w:numId w:val="2"/>
-        </w:numPr>
-        <w:spacing w:after="60"/>
-      </w:pPr>
-      <w:r>
-        <w:t>Score de confiance</w:t>
-      </w:r>
-    </w:p>
-    <w:p>
-      <w:pPr>
-        <w:pStyle w:val="Paragraphedeliste"/>
-        <w:numPr>
-          <w:ilvl w:val="0"/>
-          <w:numId w:val="2"/>
-        </w:numPr>
-        <w:spacing w:after="60"/>
-      </w:pPr>
-      <w:r>
-        <w:t>Décision finale</w:t>
-      </w:r>
-    </w:p>
-    <w:p>
-      <w:pPr>
-        <w:pStyle w:val="Paragraphedeliste"/>
-        <w:numPr>
-          <w:ilvl w:val="0"/>
-          <w:numId w:val="2"/>
-        </w:numPr>
-        <w:spacing w:after="60"/>
-      </w:pPr>
-      <w:r>
-        <w:t>Résultat</w:t>
+        <w:t>Le bot mémorise les configurations déjà rencontrées.</w:t>
       </w:r>
     </w:p>
     <w:p>
@@ -2961,7 +3102,7 @@
         <w:spacing w:after="140" w:line="276" w:lineRule="auto"/>
       </w:pPr>
       <w:r>
-        <w:t>Le système est entièrement traçable.</w:t>
+        <w:t>Lorsqu'une situation proche réapparaît, il peut comparer avec des cas passés pour enrichir son analyse.</w:t>
       </w:r>
     </w:p>
     <w:p>
@@ -2977,7 +3118,7 @@
           <w:sz w:val="18"/>
           <w:szCs w:val="18"/>
         </w:rPr>
-        <w:t>MODULE 10</w:t>
+        <w:t>MODULE 11</w:t>
       </w:r>
     </w:p>
     <w:p>
@@ -2993,7 +3134,7 @@
           <w:sz w:val="22"/>
           <w:szCs w:val="22"/>
         </w:rPr>
-        <w:t>Mémoire</w:t>
+        <w:t>Coach IA</w:t>
       </w:r>
     </w:p>
     <w:p>
@@ -3001,7 +3142,46 @@
         <w:spacing w:after="140" w:line="276" w:lineRule="auto"/>
       </w:pPr>
       <w:r>
-        <w:t>Le bot mémorise les configurations déjà rencontrées.</w:t>
+        <w:t>Il analyse :</w:t>
+      </w:r>
+    </w:p>
+    <w:p>
+      <w:pPr>
+        <w:pStyle w:val="Paragraphedeliste"/>
+        <w:numPr>
+          <w:ilvl w:val="0"/>
+          <w:numId w:val="2"/>
+        </w:numPr>
+        <w:spacing w:after="60"/>
+      </w:pPr>
+      <w:r>
+        <w:t>Les erreurs récurrentes</w:t>
+      </w:r>
+    </w:p>
+    <w:p>
+      <w:pPr>
+        <w:pStyle w:val="Paragraphedeliste"/>
+        <w:numPr>
+          <w:ilvl w:val="0"/>
+          <w:numId w:val="2"/>
+        </w:numPr>
+        <w:spacing w:after="60"/>
+      </w:pPr>
+      <w:r>
+        <w:t>Les forces des stratégies</w:t>
+      </w:r>
+    </w:p>
+    <w:p>
+      <w:pPr>
+        <w:pStyle w:val="Paragraphedeliste"/>
+        <w:numPr>
+          <w:ilvl w:val="0"/>
+          <w:numId w:val="2"/>
+        </w:numPr>
+        <w:spacing w:after="60"/>
+      </w:pPr>
+      <w:r>
+        <w:t>Les périodes où certaines approches deviennent moins efficaces</w:t>
       </w:r>
     </w:p>
     <w:p>
@@ -3009,7 +3189,7 @@
         <w:spacing w:after="140" w:line="276" w:lineRule="auto"/>
       </w:pPr>
       <w:r>
-        <w:t>Lorsqu'une situation proche réapparaît, il peut comparer avec des cas passés pour enrichir son analyse.</w:t>
+        <w:t>Il formule des propositions d'amélioration, mais ne modifie jamais directement le système.</w:t>
       </w:r>
     </w:p>
     <w:p>
@@ -3025,7 +3205,7 @@
           <w:sz w:val="18"/>
           <w:szCs w:val="18"/>
         </w:rPr>
-        <w:t>MODULE 11</w:t>
+        <w:t>MODULE 12</w:t>
       </w:r>
     </w:p>
     <w:p>
@@ -3041,7 +3221,7 @@
           <w:sz w:val="22"/>
           <w:szCs w:val="22"/>
         </w:rPr>
-        <w:t>Coach IA</w:t>
+        <w:t>Laboratoire</w:t>
       </w:r>
     </w:p>
     <w:p>
@@ -3049,46 +3229,71 @@
         <w:spacing w:after="140" w:line="276" w:lineRule="auto"/>
       </w:pPr>
       <w:r>
-        <w:t>Il analyse :</w:t>
-      </w:r>
-    </w:p>
-    <w:p>
-      <w:pPr>
-        <w:pStyle w:val="Paragraphedeliste"/>
-        <w:numPr>
-          <w:ilvl w:val="0"/>
-          <w:numId w:val="2"/>
-        </w:numPr>
-        <w:spacing w:after="60"/>
-      </w:pPr>
-      <w:r>
-        <w:t>Les erreurs récurrentes</w:t>
-      </w:r>
-    </w:p>
-    <w:p>
-      <w:pPr>
-        <w:pStyle w:val="Paragraphedeliste"/>
-        <w:numPr>
-          <w:ilvl w:val="0"/>
-          <w:numId w:val="2"/>
-        </w:numPr>
-        <w:spacing w:after="60"/>
-      </w:pPr>
-      <w:r>
-        <w:t>Les forces des stratégies</w:t>
-      </w:r>
-    </w:p>
-    <w:p>
-      <w:pPr>
-        <w:pStyle w:val="Paragraphedeliste"/>
-        <w:numPr>
-          <w:ilvl w:val="0"/>
-          <w:numId w:val="2"/>
-        </w:numPr>
-        <w:spacing w:after="60"/>
-      </w:pPr>
-      <w:r>
-        <w:t>Les périodes où certaines approches deviennent moins efficaces</w:t>
+        <w:t>Toutes les idées sont testées ici. Méthodes :</w:t>
+      </w:r>
+    </w:p>
+    <w:p>
+      <w:pPr>
+        <w:pStyle w:val="Paragraphedeliste"/>
+        <w:numPr>
+          <w:ilvl w:val="0"/>
+          <w:numId w:val="2"/>
+        </w:numPr>
+        <w:spacing w:after="60"/>
+      </w:pPr>
+      <w:proofErr w:type="spellStart"/>
+      <w:r>
+        <w:t>Backtests</w:t>
+      </w:r>
+      <w:proofErr w:type="spellEnd"/>
+    </w:p>
+    <w:p>
+      <w:pPr>
+        <w:pStyle w:val="Paragraphedeliste"/>
+        <w:numPr>
+          <w:ilvl w:val="0"/>
+          <w:numId w:val="2"/>
+        </w:numPr>
+        <w:spacing w:after="60"/>
+      </w:pPr>
+      <w:proofErr w:type="spellStart"/>
+      <w:r>
+        <w:t>Walk-forward</w:t>
+      </w:r>
+      <w:proofErr w:type="spellEnd"/>
+      <w:r>
+        <w:t xml:space="preserve"> </w:t>
+      </w:r>
+      <w:proofErr w:type="spellStart"/>
+      <w:r>
+        <w:t>analysis</w:t>
+      </w:r>
+      <w:proofErr w:type="spellEnd"/>
+    </w:p>
+    <w:p>
+      <w:pPr>
+        <w:pStyle w:val="Paragraphedeliste"/>
+        <w:numPr>
+          <w:ilvl w:val="0"/>
+          <w:numId w:val="2"/>
+        </w:numPr>
+        <w:spacing w:after="60"/>
+      </w:pPr>
+      <w:r>
+        <w:t>Paper trading</w:t>
+      </w:r>
+    </w:p>
+    <w:p>
+      <w:pPr>
+        <w:pStyle w:val="Paragraphedeliste"/>
+        <w:numPr>
+          <w:ilvl w:val="0"/>
+          <w:numId w:val="2"/>
+        </w:numPr>
+        <w:spacing w:after="60"/>
+      </w:pPr>
+      <w:r>
+        <w:t>Comparaison avec la version actuelle</w:t>
       </w:r>
     </w:p>
     <w:p>
@@ -3096,7 +3301,7 @@
         <w:spacing w:after="140" w:line="276" w:lineRule="auto"/>
       </w:pPr>
       <w:r>
-        <w:t>Il formule des propositions d'amélioration, mais ne modifie jamais directement le système.</w:t>
+        <w:t>Une idée est rejetée si elle ne démontre pas une amélioration robuste.</w:t>
       </w:r>
     </w:p>
     <w:p>
@@ -3112,7 +3317,7 @@
           <w:sz w:val="18"/>
           <w:szCs w:val="18"/>
         </w:rPr>
-        <w:t>MODULE 12</w:t>
+        <w:t>MODULE 13</w:t>
       </w:r>
     </w:p>
     <w:p>
@@ -3128,8 +3333,91 @@
           <w:sz w:val="22"/>
           <w:szCs w:val="22"/>
         </w:rPr>
-        <w:t>Laboratoir</w:t>
-      </w:r>
+        <w:t>Superviseur</w:t>
+      </w:r>
+    </w:p>
+    <w:p>
+      <w:pPr>
+        <w:spacing w:after="140" w:line="276" w:lineRule="auto"/>
+      </w:pPr>
+      <w:r>
+        <w:t>Le superviseur :</w:t>
+      </w:r>
+    </w:p>
+    <w:p>
+      <w:pPr>
+        <w:pStyle w:val="Paragraphedeliste"/>
+        <w:numPr>
+          <w:ilvl w:val="0"/>
+          <w:numId w:val="2"/>
+        </w:numPr>
+        <w:spacing w:after="60"/>
+      </w:pPr>
+      <w:r>
+        <w:t>Surveille la santé du système</w:t>
+      </w:r>
+    </w:p>
+    <w:p>
+      <w:pPr>
+        <w:pStyle w:val="Paragraphedeliste"/>
+        <w:numPr>
+          <w:ilvl w:val="0"/>
+          <w:numId w:val="2"/>
+        </w:numPr>
+        <w:spacing w:after="60"/>
+      </w:pPr>
+      <w:r>
+        <w:t>Vérifie les performances</w:t>
+      </w:r>
+    </w:p>
+    <w:p>
+      <w:pPr>
+        <w:pStyle w:val="Paragraphedeliste"/>
+        <w:numPr>
+          <w:ilvl w:val="0"/>
+          <w:numId w:val="2"/>
+        </w:numPr>
+        <w:spacing w:after="60"/>
+      </w:pPr>
+      <w:r>
+        <w:lastRenderedPageBreak/>
+        <w:t>Détecte les anomalies</w:t>
+      </w:r>
+    </w:p>
+    <w:p>
+      <w:pPr>
+        <w:pStyle w:val="Paragraphedeliste"/>
+        <w:numPr>
+          <w:ilvl w:val="0"/>
+          <w:numId w:val="2"/>
+        </w:numPr>
+        <w:spacing w:after="60"/>
+      </w:pPr>
+      <w:r>
+        <w:t>Active un arrêt d'urgence si nécessaire</w:t>
+      </w:r>
+    </w:p>
+    <w:p>
+      <w:pPr>
+        <w:shd w:val="clear" w:color="auto" w:fill="1B5FA8"/>
+        <w:spacing w:before="320" w:after="120"/>
+      </w:pPr>
+      <w:r>
+        <w:rPr>
+          <w:b/>
+          <w:bCs/>
+          <w:color w:val="FFFFFF"/>
+          <w:sz w:val="18"/>
+          <w:szCs w:val="18"/>
+        </w:rPr>
+        <w:t>MODULE 14</w:t>
+      </w:r>
+    </w:p>
+    <w:p>
+      <w:pPr>
+        <w:pStyle w:val="Titre3"/>
+        <w:spacing w:before="220" w:after="100"/>
+      </w:pPr>
       <w:r>
         <w:rPr>
           <w:b/>
@@ -3138,7 +3426,7 @@
           <w:sz w:val="22"/>
           <w:szCs w:val="22"/>
         </w:rPr>
-        <w:t>e</w:t>
+        <w:t>Tableau de bord</w:t>
       </w:r>
     </w:p>
     <w:p>
@@ -3146,199 +3434,6 @@
         <w:spacing w:after="140" w:line="276" w:lineRule="auto"/>
       </w:pPr>
       <w:r>
-        <w:t>Toutes les idées sont testées ici. Méthodes :</w:t>
-      </w:r>
-    </w:p>
-    <w:p>
-      <w:pPr>
-        <w:pStyle w:val="Paragraphedeliste"/>
-        <w:numPr>
-          <w:ilvl w:val="0"/>
-          <w:numId w:val="2"/>
-        </w:numPr>
-        <w:spacing w:after="60"/>
-      </w:pPr>
-      <w:r>
-        <w:t>Backtests</w:t>
-      </w:r>
-    </w:p>
-    <w:p>
-      <w:pPr>
-        <w:pStyle w:val="Paragraphedeliste"/>
-        <w:numPr>
-          <w:ilvl w:val="0"/>
-          <w:numId w:val="2"/>
-        </w:numPr>
-        <w:spacing w:after="60"/>
-      </w:pPr>
-      <w:r>
-        <w:t>Walk-forward analysis</w:t>
-      </w:r>
-    </w:p>
-    <w:p>
-      <w:pPr>
-        <w:pStyle w:val="Paragraphedeliste"/>
-        <w:numPr>
-          <w:ilvl w:val="0"/>
-          <w:numId w:val="2"/>
-        </w:numPr>
-        <w:spacing w:after="60"/>
-      </w:pPr>
-      <w:r>
-        <w:t>Paper trading</w:t>
-      </w:r>
-    </w:p>
-    <w:p>
-      <w:pPr>
-        <w:pStyle w:val="Paragraphedeliste"/>
-        <w:numPr>
-          <w:ilvl w:val="0"/>
-          <w:numId w:val="2"/>
-        </w:numPr>
-        <w:spacing w:after="60"/>
-      </w:pPr>
-      <w:r>
-        <w:t>Comparaison avec la version actuelle</w:t>
-      </w:r>
-    </w:p>
-    <w:p>
-      <w:pPr>
-        <w:spacing w:after="140" w:line="276" w:lineRule="auto"/>
-      </w:pPr>
-      <w:r>
-        <w:t>Une idée est rejetée si elle ne démontre pas une amélioration robuste.</w:t>
-      </w:r>
-    </w:p>
-    <w:p>
-      <w:pPr>
-        <w:shd w:val="clear" w:color="auto" w:fill="1B5FA8"/>
-        <w:spacing w:before="320" w:after="120"/>
-      </w:pPr>
-      <w:r>
-        <w:rPr>
-          <w:b/>
-          <w:bCs/>
-          <w:color w:val="FFFFFF"/>
-          <w:sz w:val="18"/>
-          <w:szCs w:val="18"/>
-        </w:rPr>
-        <w:t>MODULE 13</w:t>
-      </w:r>
-    </w:p>
-    <w:p>
-      <w:pPr>
-        <w:pStyle w:val="Titre3"/>
-        <w:spacing w:before="220" w:after="100"/>
-      </w:pPr>
-      <w:r>
-        <w:rPr>
-          <w:b/>
-          <w:bCs/>
-          <w:color w:val="0B2545"/>
-          <w:sz w:val="22"/>
-          <w:szCs w:val="22"/>
-        </w:rPr>
-        <w:t>Superviseur</w:t>
-      </w:r>
-    </w:p>
-    <w:p>
-      <w:pPr>
-        <w:spacing w:after="140" w:line="276" w:lineRule="auto"/>
-      </w:pPr>
-      <w:r>
-        <w:t>Le superviseur :</w:t>
-      </w:r>
-    </w:p>
-    <w:p>
-      <w:pPr>
-        <w:pStyle w:val="Paragraphedeliste"/>
-        <w:numPr>
-          <w:ilvl w:val="0"/>
-          <w:numId w:val="2"/>
-        </w:numPr>
-        <w:spacing w:after="60"/>
-      </w:pPr>
-      <w:r>
-        <w:t>Surveille la santé du système</w:t>
-      </w:r>
-    </w:p>
-    <w:p>
-      <w:pPr>
-        <w:pStyle w:val="Paragraphedeliste"/>
-        <w:numPr>
-          <w:ilvl w:val="0"/>
-          <w:numId w:val="2"/>
-        </w:numPr>
-        <w:spacing w:after="60"/>
-      </w:pPr>
-      <w:r>
-        <w:t>Vérifie les performances</w:t>
-      </w:r>
-    </w:p>
-    <w:p>
-      <w:pPr>
-        <w:pStyle w:val="Paragraphedeliste"/>
-        <w:numPr>
-          <w:ilvl w:val="0"/>
-          <w:numId w:val="2"/>
-        </w:numPr>
-        <w:spacing w:after="60"/>
-      </w:pPr>
-      <w:r>
-        <w:lastRenderedPageBreak/>
-        <w:t>Détecte les anomalies</w:t>
-      </w:r>
-    </w:p>
-    <w:p>
-      <w:pPr>
-        <w:pStyle w:val="Paragraphedeliste"/>
-        <w:numPr>
-          <w:ilvl w:val="0"/>
-          <w:numId w:val="2"/>
-        </w:numPr>
-        <w:spacing w:after="60"/>
-      </w:pPr>
-      <w:r>
-        <w:t>Active un arrêt d'urgence si nécessaire</w:t>
-      </w:r>
-    </w:p>
-    <w:p>
-      <w:pPr>
-        <w:shd w:val="clear" w:color="auto" w:fill="1B5FA8"/>
-        <w:spacing w:before="320" w:after="120"/>
-      </w:pPr>
-      <w:r>
-        <w:rPr>
-          <w:b/>
-          <w:bCs/>
-          <w:color w:val="FFFFFF"/>
-          <w:sz w:val="18"/>
-          <w:szCs w:val="18"/>
-        </w:rPr>
-        <w:t>MODULE 14</w:t>
-      </w:r>
-    </w:p>
-    <w:p>
-      <w:pPr>
-        <w:pStyle w:val="Titre3"/>
-        <w:spacing w:before="220" w:after="100"/>
-      </w:pPr>
-      <w:r>
-        <w:rPr>
-          <w:b/>
-          <w:bCs/>
-          <w:color w:val="0B2545"/>
-          <w:sz w:val="22"/>
-          <w:szCs w:val="22"/>
-        </w:rPr>
-        <w:t>Tableau de bord</w:t>
-      </w:r>
-    </w:p>
-    <w:p>
-      <w:pPr>
-        <w:spacing w:after="140" w:line="276" w:lineRule="auto"/>
-      </w:pPr>
-      <w:r>
         <w:t>Affiche en temps réel :</w:t>
       </w:r>
     </w:p>
@@ -3364,22 +3459,26 @@
         </w:numPr>
         <w:spacing w:after="60"/>
       </w:pPr>
+      <w:proofErr w:type="spellStart"/>
       <w:r>
         <w:t>PnL</w:t>
       </w:r>
-    </w:p>
-    <w:p>
-      <w:pPr>
-        <w:pStyle w:val="Paragraphedeliste"/>
-        <w:numPr>
-          <w:ilvl w:val="0"/>
-          <w:numId w:val="2"/>
-        </w:numPr>
-        <w:spacing w:after="60"/>
-      </w:pPr>
+      <w:proofErr w:type="spellEnd"/>
+    </w:p>
+    <w:p>
+      <w:pPr>
+        <w:pStyle w:val="Paragraphedeliste"/>
+        <w:numPr>
+          <w:ilvl w:val="0"/>
+          <w:numId w:val="2"/>
+        </w:numPr>
+        <w:spacing w:after="60"/>
+      </w:pPr>
+      <w:proofErr w:type="spellStart"/>
       <w:r>
         <w:t>Drawdown</w:t>
       </w:r>
+      <w:proofErr w:type="spellEnd"/>
     </w:p>
     <w:p>
       <w:pPr>
@@ -3495,12 +3594,6 @@
         <w:gridCol w:w="6200"/>
       </w:tblGrid>
       <w:tr>
-        <w:tblPrEx>
-          <w:tblCellMar>
-            <w:top w:w="0" w:type="dxa"/>
-            <w:bottom w:w="0" w:type="dxa"/>
-          </w:tblCellMar>
-        </w:tblPrEx>
         <w:trPr>
           <w:jc w:val="center"/>
         </w:trPr>
@@ -3578,12 +3671,6 @@
         <w:gridCol w:w="6200"/>
       </w:tblGrid>
       <w:tr>
-        <w:tblPrEx>
-          <w:tblCellMar>
-            <w:top w:w="0" w:type="dxa"/>
-            <w:bottom w:w="0" w:type="dxa"/>
-          </w:tblCellMar>
-        </w:tblPrEx>
         <w:trPr>
           <w:jc w:val="center"/>
         </w:trPr>
@@ -3661,12 +3748,6 @@
         <w:gridCol w:w="6200"/>
       </w:tblGrid>
       <w:tr>
-        <w:tblPrEx>
-          <w:tblCellMar>
-            <w:top w:w="0" w:type="dxa"/>
-            <w:bottom w:w="0" w:type="dxa"/>
-          </w:tblCellMar>
-        </w:tblPrEx>
         <w:trPr>
           <w:jc w:val="center"/>
         </w:trPr>
@@ -3692,6 +3773,7 @@
             <w:pPr>
               <w:jc w:val="center"/>
             </w:pPr>
+            <w:proofErr w:type="spellStart"/>
             <w:r>
               <w:rPr>
                 <w:b/>
@@ -3702,6 +3784,7 @@
               </w:rPr>
               <w:t>Backtest</w:t>
             </w:r>
+            <w:proofErr w:type="spellEnd"/>
           </w:p>
         </w:tc>
       </w:tr>
@@ -3744,12 +3827,6 @@
         <w:gridCol w:w="6200"/>
       </w:tblGrid>
       <w:tr>
-        <w:tblPrEx>
-          <w:tblCellMar>
-            <w:top w:w="0" w:type="dxa"/>
-            <w:bottom w:w="0" w:type="dxa"/>
-          </w:tblCellMar>
-        </w:tblPrEx>
         <w:trPr>
           <w:jc w:val="center"/>
         </w:trPr>
@@ -3775,6 +3852,7 @@
             <w:pPr>
               <w:jc w:val="center"/>
             </w:pPr>
+            <w:proofErr w:type="spellStart"/>
             <w:r>
               <w:rPr>
                 <w:b/>
@@ -3783,8 +3861,31 @@
                 <w:sz w:val="20"/>
                 <w:szCs w:val="20"/>
               </w:rPr>
-              <w:t>Walk Forward</w:t>
-            </w:r>
+              <w:t>Walk</w:t>
+            </w:r>
+            <w:proofErr w:type="spellEnd"/>
+            <w:r>
+              <w:rPr>
+                <w:b/>
+                <w:bCs/>
+                <w:color w:val="0B2545"/>
+                <w:sz w:val="20"/>
+                <w:szCs w:val="20"/>
+              </w:rPr>
+              <w:t xml:space="preserve"> </w:t>
+            </w:r>
+            <w:proofErr w:type="spellStart"/>
+            <w:r>
+              <w:rPr>
+                <w:b/>
+                <w:bCs/>
+                <w:color w:val="0B2545"/>
+                <w:sz w:val="20"/>
+                <w:szCs w:val="20"/>
+              </w:rPr>
+              <w:t>Forward</w:t>
+            </w:r>
+            <w:proofErr w:type="spellEnd"/>
           </w:p>
         </w:tc>
       </w:tr>
@@ -3827,12 +3928,6 @@
         <w:gridCol w:w="6200"/>
       </w:tblGrid>
       <w:tr>
-        <w:tblPrEx>
-          <w:tblCellMar>
-            <w:top w:w="0" w:type="dxa"/>
-            <w:bottom w:w="0" w:type="dxa"/>
-          </w:tblCellMar>
-        </w:tblPrEx>
         <w:trPr>
           <w:jc w:val="center"/>
         </w:trPr>
@@ -3910,12 +4005,6 @@
         <w:gridCol w:w="6200"/>
       </w:tblGrid>
       <w:tr>
-        <w:tblPrEx>
-          <w:tblCellMar>
-            <w:top w:w="0" w:type="dxa"/>
-            <w:bottom w:w="0" w:type="dxa"/>
-          </w:tblCellMar>
-        </w:tblPrEx>
         <w:trPr>
           <w:jc w:val="center"/>
         </w:trPr>
@@ -3993,12 +4082,6 @@
         <w:gridCol w:w="6200"/>
       </w:tblGrid>
       <w:tr>
-        <w:tblPrEx>
-          <w:tblCellMar>
-            <w:top w:w="0" w:type="dxa"/>
-            <w:bottom w:w="0" w:type="dxa"/>
-          </w:tblCellMar>
-        </w:tblPrEx>
         <w:trPr>
           <w:jc w:val="center"/>
         </w:trPr>
@@ -4076,12 +4159,6 @@
         <w:gridCol w:w="6200"/>
       </w:tblGrid>
       <w:tr>
-        <w:tblPrEx>
-          <w:tblCellMar>
-            <w:top w:w="0" w:type="dxa"/>
-            <w:bottom w:w="0" w:type="dxa"/>
-          </w:tblCellMar>
-        </w:tblPrEx>
         <w:trPr>
           <w:jc w:val="center"/>
         </w:trPr>
@@ -4179,13 +4256,63 @@
       <w:pPr>
         <w:spacing w:after="200"/>
       </w:pPr>
+      <w:proofErr w:type="gramStart"/>
       <w:r>
         <w:rPr>
           <w:sz w:val="20"/>
           <w:szCs w:val="20"/>
         </w:rPr>
-        <w:t>Python  •  FastAPI  •  CCXT  •  WebSockets  •  asyncio</w:t>
-      </w:r>
+        <w:t>Python  •</w:t>
+      </w:r>
+      <w:proofErr w:type="gramEnd"/>
+      <w:r>
+        <w:rPr>
+          <w:sz w:val="20"/>
+          <w:szCs w:val="20"/>
+        </w:rPr>
+        <w:t xml:space="preserve">  </w:t>
+      </w:r>
+      <w:proofErr w:type="spellStart"/>
+      <w:r>
+        <w:rPr>
+          <w:sz w:val="20"/>
+          <w:szCs w:val="20"/>
+        </w:rPr>
+        <w:t>FastAPI</w:t>
+      </w:r>
+      <w:proofErr w:type="spellEnd"/>
+      <w:r>
+        <w:rPr>
+          <w:sz w:val="20"/>
+          <w:szCs w:val="20"/>
+        </w:rPr>
+        <w:t xml:space="preserve">  •  CCXT  •  </w:t>
+      </w:r>
+      <w:proofErr w:type="spellStart"/>
+      <w:r>
+        <w:rPr>
+          <w:sz w:val="20"/>
+          <w:szCs w:val="20"/>
+        </w:rPr>
+        <w:t>WebSockets</w:t>
+      </w:r>
+      <w:proofErr w:type="spellEnd"/>
+      <w:r>
+        <w:rPr>
+          <w:sz w:val="20"/>
+          <w:szCs w:val="20"/>
+        </w:rPr>
+        <w:t xml:space="preserve">  •  </w:t>
+      </w:r>
+      <w:proofErr w:type="spellStart"/>
+      <w:r>
+        <w:rPr>
+          <w:sz w:val="20"/>
+          <w:szCs w:val="20"/>
+        </w:rPr>
+        <w:t>asyncio</w:t>
+      </w:r>
+      <w:proofErr w:type="spellEnd"/>
     </w:p>
     <w:p>
       <w:pPr>
@@ -4207,12 +4334,21 @@
       <w:pPr>
         <w:spacing w:after="200"/>
       </w:pPr>
+      <w:proofErr w:type="gramStart"/>
       <w:r>
         <w:rPr>
           <w:sz w:val="20"/>
           <w:szCs w:val="20"/>
         </w:rPr>
-        <w:t>PostgreSQL  •  Redis  •  Parquet  •  pandas  •  Polars</w:t>
+        <w:t>PostgreSQL  •</w:t>
+      </w:r>
+      <w:proofErr w:type="gramEnd"/>
+      <w:r>
+        <w:rPr>
+          <w:sz w:val="20"/>
+          <w:szCs w:val="20"/>
+        </w:rPr>
+        <w:t xml:space="preserve">  Redis  •  Parquet  •  pandas  •  Polars</w:t>
       </w:r>
     </w:p>
     <w:p>
@@ -4235,12 +4371,94 @@
       <w:pPr>
         <w:spacing w:after="200"/>
       </w:pPr>
+      <w:proofErr w:type="spellStart"/>
+      <w:proofErr w:type="gramStart"/>
       <w:r>
         <w:rPr>
           <w:sz w:val="20"/>
           <w:szCs w:val="20"/>
         </w:rPr>
-        <w:t>scikit-learn  •  LightGBM  •  XGBoost  •  CatBoost  •  PyTorch (modèles séquentiels si justifié)</w:t>
+        <w:t>scikit</w:t>
+      </w:r>
+      <w:proofErr w:type="gramEnd"/>
+      <w:r>
+        <w:rPr>
+          <w:sz w:val="20"/>
+          <w:szCs w:val="20"/>
+        </w:rPr>
+        <w:t>-learn</w:t>
+      </w:r>
+      <w:proofErr w:type="spellEnd"/>
+      <w:r>
+        <w:rPr>
+          <w:sz w:val="20"/>
+          <w:szCs w:val="20"/>
+        </w:rPr>
+        <w:t xml:space="preserve">  •  </w:t>
+      </w:r>
+      <w:proofErr w:type="spellStart"/>
+      <w:r>
+        <w:rPr>
+          <w:sz w:val="20"/>
+          <w:szCs w:val="20"/>
+        </w:rPr>
+        <w:t>LightGBM</w:t>
+      </w:r>
+      <w:proofErr w:type="spellEnd"/>
+      <w:r>
+        <w:rPr>
+          <w:sz w:val="20"/>
+          <w:szCs w:val="20"/>
+        </w:rPr>
+        <w:t xml:space="preserve">  •  </w:t>
+      </w:r>
+      <w:proofErr w:type="spellStart"/>
+      <w:r>
+        <w:rPr>
+          <w:sz w:val="20"/>
+          <w:szCs w:val="20"/>
+        </w:rPr>
+        <w:t>XGBoost</w:t>
+      </w:r>
+      <w:proofErr w:type="spellEnd"/>
+      <w:r>
+        <w:rPr>
+          <w:sz w:val="20"/>
+          <w:szCs w:val="20"/>
+        </w:rPr>
+        <w:t xml:space="preserve">  •  </w:t>
+      </w:r>
+      <w:proofErr w:type="spellStart"/>
+      <w:r>
+        <w:rPr>
+          <w:sz w:val="20"/>
+          <w:szCs w:val="20"/>
+        </w:rPr>
+        <w:t>CatBoost</w:t>
+      </w:r>
+      <w:proofErr w:type="spellEnd"/>
+      <w:r>
+        <w:rPr>
+          <w:sz w:val="20"/>
+          <w:szCs w:val="20"/>
+        </w:rPr>
+        <w:t xml:space="preserve">  •  </w:t>
+      </w:r>
+      <w:proofErr w:type="spellStart"/>
+      <w:r>
+        <w:rPr>
+          <w:sz w:val="20"/>
+          <w:szCs w:val="20"/>
+        </w:rPr>
+        <w:t>PyTorch</w:t>
+      </w:r>
+      <w:proofErr w:type="spellEnd"/>
+      <w:r>
+        <w:rPr>
+          <w:sz w:val="20"/>
+          <w:szCs w:val="20"/>
+        </w:rPr>
+        <w:t xml:space="preserve"> (modèles séquentiels si justifié)</w:t>
       </w:r>
     </w:p>
     <w:p>
@@ -4263,12 +4481,30 @@
       <w:pPr>
         <w:spacing w:after="200"/>
       </w:pPr>
+      <w:proofErr w:type="spellStart"/>
+      <w:proofErr w:type="gramStart"/>
       <w:r>
         <w:rPr>
           <w:sz w:val="20"/>
           <w:szCs w:val="20"/>
         </w:rPr>
-        <w:t>vectorbt  •  LEAN (infrastructure quantitative avancée, optionnelle)</w:t>
+        <w:t>vectorbt</w:t>
+      </w:r>
+      <w:proofErr w:type="spellEnd"/>
+      <w:r>
+        <w:rPr>
+          <w:sz w:val="20"/>
+          <w:szCs w:val="20"/>
+        </w:rPr>
+        <w:t xml:space="preserve">  •</w:t>
+      </w:r>
+      <w:proofErr w:type="gramEnd"/>
+      <w:r>
+        <w:rPr>
+          <w:sz w:val="20"/>
+          <w:szCs w:val="20"/>
+        </w:rPr>
+        <w:t xml:space="preserve">  LEAN (infrastructure quantitative avancée, optionnelle)</w:t>
       </w:r>
     </w:p>
     <w:p>
@@ -4291,19 +4527,69 @@
       <w:pPr>
         <w:spacing w:after="200"/>
       </w:pPr>
+      <w:proofErr w:type="gramStart"/>
       <w:r>
         <w:rPr>
           <w:sz w:val="20"/>
           <w:szCs w:val="20"/>
         </w:rPr>
-        <w:t>Docker  •  GitHub Actions  •  Prometheus  •  Grafana  •  Alerte</w:t>
-      </w:r>
+        <w:t>Docker  •</w:t>
+      </w:r>
+      <w:proofErr w:type="gramEnd"/>
       <w:r>
         <w:rPr>
           <w:sz w:val="20"/>
           <w:szCs w:val="20"/>
         </w:rPr>
-        <w:t>s Telegram / Discord</w:t>
+        <w:t xml:space="preserve">  GitHub Actions  •  </w:t>
+      </w:r>
+      <w:proofErr w:type="spellStart"/>
+      <w:r>
+        <w:rPr>
+          <w:sz w:val="20"/>
+          <w:szCs w:val="20"/>
+        </w:rPr>
+        <w:t>Prometheus</w:t>
+      </w:r>
+      <w:proofErr w:type="spellEnd"/>
+      <w:r>
+        <w:rPr>
+          <w:sz w:val="20"/>
+          <w:szCs w:val="20"/>
+        </w:rPr>
+        <w:t xml:space="preserve">  •  </w:t>
+      </w:r>
+      <w:proofErr w:type="spellStart"/>
+      <w:r>
+        <w:rPr>
+          <w:sz w:val="20"/>
+          <w:szCs w:val="20"/>
+        </w:rPr>
+        <w:t>Grafana</w:t>
+      </w:r>
+      <w:proofErr w:type="spellEnd"/>
+      <w:r>
+        <w:rPr>
+          <w:sz w:val="20"/>
+          <w:szCs w:val="20"/>
+        </w:rPr>
+        <w:t xml:space="preserve">  •  Alertes </w:t>
+      </w:r>
+      <w:proofErr w:type="spellStart"/>
+      <w:r>
+        <w:rPr>
+          <w:sz w:val="20"/>
+          <w:szCs w:val="20"/>
+        </w:rPr>
+        <w:t>Telegram</w:t>
+      </w:r>
+      <w:proofErr w:type="spellEnd"/>
+      <w:r>
+        <w:rPr>
+          <w:sz w:val="20"/>
+          <w:szCs w:val="20"/>
+        </w:rPr>
+        <w:t xml:space="preserve"> / Discord</w:t>
       </w:r>
     </w:p>
     <w:p>
@@ -4353,12 +4639,6 @@
         <w:gridCol w:w="7150"/>
       </w:tblGrid>
       <w:tr>
-        <w:tblPrEx>
-          <w:tblCellMar>
-            <w:top w:w="0" w:type="dxa"/>
-            <w:bottom w:w="0" w:type="dxa"/>
-          </w:tblCellMar>
-        </w:tblPrEx>
         <w:tc>
           <w:tcPr>
             <w:tcW w:w="2200" w:type="dxa"/>
@@ -4486,12 +4766,6 @@
         <w:gridCol w:w="7150"/>
       </w:tblGrid>
       <w:tr>
-        <w:tblPrEx>
-          <w:tblCellMar>
-            <w:top w:w="0" w:type="dxa"/>
-            <w:bottom w:w="0" w:type="dxa"/>
-          </w:tblCellMar>
-        </w:tblPrEx>
         <w:tc>
           <w:tcPr>
             <w:tcW w:w="2200" w:type="dxa"/>
@@ -4607,12 +4881,6 @@
         <w:gridCol w:w="7150"/>
       </w:tblGrid>
       <w:tr>
-        <w:tblPrEx>
-          <w:tblCellMar>
-            <w:top w:w="0" w:type="dxa"/>
-            <w:bottom w:w="0" w:type="dxa"/>
-          </w:tblCellMar>
-        </w:tblPrEx>
         <w:tc>
           <w:tcPr>
             <w:tcW w:w="2200" w:type="dxa"/>
@@ -4728,12 +4996,6 @@
         <w:gridCol w:w="7150"/>
       </w:tblGrid>
       <w:tr>
-        <w:tblPrEx>
-          <w:tblCellMar>
-            <w:top w:w="0" w:type="dxa"/>
-            <w:bottom w:w="0" w:type="dxa"/>
-          </w:tblCellMar>
-        </w:tblPrEx>
         <w:tc>
           <w:tcPr>
             <w:tcW w:w="2200" w:type="dxa"/>
@@ -4849,12 +5111,6 @@
         <w:gridCol w:w="7150"/>
       </w:tblGrid>
       <w:tr>
-        <w:tblPrEx>
-          <w:tblCellMar>
-            <w:top w:w="0" w:type="dxa"/>
-            <w:bottom w:w="0" w:type="dxa"/>
-          </w:tblCellMar>
-        </w:tblPrEx>
         <w:tc>
           <w:tcPr>
             <w:tcW w:w="2200" w:type="dxa"/>
@@ -4949,7 +5205,22 @@
         <w:spacing w:after="140" w:line="276" w:lineRule="auto"/>
       </w:pPr>
       <w:r>
-        <w:t>L'idée centrale n'est pas de créer un bot qui trade, mais un système qui apprend à construire et améliorer ses propres stratégies de manière contrôlée.</w:t>
+        <w:t xml:space="preserve">L'idée centrale </w:t>
+      </w:r>
+      <w:r>
+        <w:t xml:space="preserve">est de créer un bot qui </w:t>
+      </w:r>
+      <w:r>
+        <w:t>Trade</w:t>
+      </w:r>
+      <w:r>
+        <w:t xml:space="preserve">, </w:t>
+      </w:r>
+      <w:r>
+        <w:t>avec</w:t>
+      </w:r>
+      <w:r>
+        <w:t xml:space="preserve"> un système qui apprend à construire et améliorer ses propres stratégies de manière contrôlée.</w:t>
       </w:r>
     </w:p>
     <w:p>
@@ -4957,10 +5228,7 @@
         <w:spacing w:after="140" w:line="276" w:lineRule="auto"/>
       </w:pPr>
       <w:r>
-        <w:t>Chaque chan</w:t>
-      </w:r>
-      <w:r>
-        <w:t>gement est proposé, testé, validé puis déployé progressivement. Cette discipline réduit le risque de dégrader les performances en poursuivant des optimisations qui ne fonctionnent que sur les données historiques.</w:t>
+        <w:t>Chaque changement est proposé, testé, validé puis déployé progressivement. Cette discipline réduit le risque de dégrader les performances en poursuivant des optimisations qui ne fonctionnent que sur les données historiques.</w:t>
       </w:r>
     </w:p>
     <w:p>
@@ -4994,7 +5262,6 @@
         </w:rPr>
         <w:t>AEGIS AI QUANT V1 — Robustesse avant tout.</w:t>
       </w:r>
-      <w:bookmarkEnd w:id="0"/>
     </w:p>
     <w:sectPr>
       <w:headerReference w:type="default" r:id="rId7"/>
@@ -5072,7 +5339,7 @@
         <w:sz w:val="16"/>
         <w:szCs w:val="16"/>
       </w:rPr>
-      <w:t>1</w:t>
+      <w:t>7</w:t>
     </w:r>
     <w:r>
       <w:rPr>

</xml_diff>